<commit_message>
Update CV and site publications
Apply CV feedback (title-case citations, spacing, ordering, primary
instructor label), update in-progress papers, remove research experience,
and verify publication details against Google Scholar and Crossref.

Co-Authored-By: Claude Opus 5.5 <noreply@anthropic.com>
</commit_message>
<xml_diff>
--- a/Kate Petrova CV.docx
+++ b/Kate Petrova CV.docx
@@ -81,14 +81,7 @@
           <w:rFonts w:cs="Aptos"/>
           <w:color w:val="747474"/>
         </w:rPr>
-        <w:t>•</w:t>
-      </w:r>
-      <w:r>
-        <w:rPr>
-          <w:rFonts w:cs="Aptos"/>
-          <w:color w:val="747474"/>
-        </w:rPr>
-        <w:t xml:space="preserve"> </w:t>
+        <w:t xml:space="preserve">• </w:t>
       </w:r>
       <w:r>
         <w:t xml:space="preserve"> </w:t>
@@ -173,8 +166,6 @@
             </w:r>
             <w:r>
               <w:t xml:space="preserve"> </w:t>
-            </w:r>
-            <w:r>
               <w:tab/>
               <w:t xml:space="preserve"> </w:t>
             </w:r>
@@ -206,7 +197,7 @@
               <w:jc w:val="both"/>
             </w:pPr>
             <w:r>
-              <w:t>2021 – 2027 (expected)</w:t>
+              <w:t>2021–2027 (expected)</w:t>
             </w:r>
           </w:p>
         </w:tc>
@@ -285,7 +276,7 @@
                 <w:color w:val="A70006"/>
                 <w:sz w:val="24"/>
               </w:rPr>
-              <w:t>RESEARCH EXPERIENCE</w:t>
+              <w:t>HONORS AND AWARDS</w:t>
             </w:r>
             <w:r>
               <w:t xml:space="preserve"> </w:t>
@@ -309,202 +300,7 @@
               <w:jc w:val="both"/>
             </w:pPr>
             <w:r>
-              <w:t>2016 – 2020</w:t>
-            </w:r>
-          </w:p>
-        </w:tc>
-      </w:tr>
-      <w:tr>
-        <w:trPr>
-          <w:trHeight w:val="734"/>
-        </w:trPr>
-        <w:tc>
-          <w:tcPr>
-            <w:tcW w:w="9074" w:type="dxa"/>
-            <w:tcBorders>
-              <w:top w:val="single" w:sz="6" w:space="0" w:color="000000"/>
-              <w:left w:val="nil"/>
-              <w:bottom w:val="nil"/>
-              <w:right w:val="nil"/>
-            </w:tcBorders>
-          </w:tcPr>
-          <w:p>
-            <w:pPr>
-              <w:spacing w:after="0" w:line="259" w:lineRule="auto"/>
-              <w:ind w:left="0" w:right="4906" w:firstLine="0"/>
-              <w:jc w:val="both"/>
-            </w:pPr>
-            <w:r>
-              <w:rPr>
-                <w:b/>
-              </w:rPr>
-              <w:t>Harvard Study of Adult Development</w:t>
-            </w:r>
-            <w:r>
-              <w:t xml:space="preserve"> Research assistant </w:t>
-            </w:r>
-          </w:p>
-        </w:tc>
-        <w:tc>
-          <w:tcPr>
-            <w:tcW w:w="1031" w:type="dxa"/>
-            <w:tcBorders>
-              <w:top w:val="single" w:sz="6" w:space="0" w:color="000000"/>
-              <w:left w:val="nil"/>
-              <w:bottom w:val="nil"/>
-              <w:right w:val="nil"/>
-            </w:tcBorders>
-          </w:tcPr>
-          <w:p>
-            <w:pPr>
-              <w:spacing w:after="0" w:line="259" w:lineRule="auto"/>
-              <w:ind w:left="0" w:firstLine="0"/>
-              <w:jc w:val="both"/>
-            </w:pPr>
-            <w:r>
-              <w:t>2020 – 2021</w:t>
-            </w:r>
-          </w:p>
-        </w:tc>
-      </w:tr>
-      <w:tr>
-        <w:trPr>
-          <w:trHeight w:val="833"/>
-        </w:trPr>
-        <w:tc>
-          <w:tcPr>
-            <w:tcW w:w="9074" w:type="dxa"/>
-            <w:tcBorders>
-              <w:top w:val="nil"/>
-              <w:left w:val="nil"/>
-              <w:bottom w:val="nil"/>
-              <w:right w:val="nil"/>
-            </w:tcBorders>
-            <w:vAlign w:val="center"/>
-          </w:tcPr>
-          <w:p>
-            <w:pPr>
-              <w:spacing w:after="0" w:line="259" w:lineRule="auto"/>
-              <w:ind w:left="0" w:right="4797" w:firstLine="0"/>
-              <w:jc w:val="both"/>
-            </w:pPr>
-            <w:r>
-              <w:rPr>
-                <w:b/>
-              </w:rPr>
-              <w:t>Schulz Lab  •  Bryn Mawr College</w:t>
-            </w:r>
-            <w:r>
-              <w:t xml:space="preserve"> Undergraduate research assistant </w:t>
-            </w:r>
-          </w:p>
-        </w:tc>
-        <w:tc>
-          <w:tcPr>
-            <w:tcW w:w="1031" w:type="dxa"/>
-            <w:tcBorders>
-              <w:top w:val="nil"/>
-              <w:left w:val="nil"/>
-              <w:bottom w:val="nil"/>
-              <w:right w:val="nil"/>
-            </w:tcBorders>
-          </w:tcPr>
-          <w:p>
-            <w:pPr>
-              <w:spacing w:after="0" w:line="259" w:lineRule="auto"/>
-              <w:ind w:left="0" w:firstLine="0"/>
-              <w:jc w:val="both"/>
-            </w:pPr>
-            <w:r>
-              <w:t>2017 – 2020</w:t>
-            </w:r>
-          </w:p>
-        </w:tc>
-      </w:tr>
-      <w:tr>
-        <w:trPr>
-          <w:trHeight w:val="1454"/>
-        </w:trPr>
-        <w:tc>
-          <w:tcPr>
-            <w:tcW w:w="9074" w:type="dxa"/>
-            <w:tcBorders>
-              <w:top w:val="nil"/>
-              <w:left w:val="nil"/>
-              <w:bottom w:val="single" w:sz="6" w:space="0" w:color="000000"/>
-              <w:right w:val="nil"/>
-            </w:tcBorders>
-            <w:vAlign w:val="bottom"/>
-          </w:tcPr>
-          <w:p>
-            <w:pPr>
-              <w:spacing w:after="120" w:line="261" w:lineRule="auto"/>
-              <w:ind w:left="0" w:right="2055" w:firstLine="0"/>
-              <w:jc w:val="both"/>
-            </w:pPr>
-            <w:r>
-              <w:rPr>
-                <w:b/>
-              </w:rPr>
-              <w:t>Integrative Decision Neuroscience Lab  •  University of Pennsylvania</w:t>
-            </w:r>
-            <w:r>
-              <w:t xml:space="preserve"> Research intern </w:t>
-            </w:r>
-          </w:p>
-          <w:p>
-            <w:pPr>
-              <w:spacing w:after="55" w:line="259" w:lineRule="auto"/>
-              <w:ind w:left="0" w:firstLine="0"/>
-            </w:pPr>
-            <w:r>
-              <w:rPr>
-                <w:b/>
-                <w:sz w:val="22"/>
-              </w:rPr>
-              <w:t xml:space="preserve"> </w:t>
-            </w:r>
-          </w:p>
-          <w:p>
-            <w:pPr>
-              <w:spacing w:after="0" w:line="259" w:lineRule="auto"/>
-              <w:ind w:left="0" w:firstLine="0"/>
-            </w:pPr>
-            <w:r>
-              <w:rPr>
-                <w:rFonts w:ascii="Cambria" w:eastAsia="Cambria" w:hAnsi="Cambria" w:cs="Cambria"/>
-                <w:b/>
-                <w:color w:val="A70006"/>
-                <w:sz w:val="24"/>
-              </w:rPr>
-              <w:t>HONORS AND AWARDS</w:t>
-            </w:r>
-            <w:r>
-              <w:rPr>
-                <w:rFonts w:ascii="Cambria" w:eastAsia="Cambria" w:hAnsi="Cambria" w:cs="Cambria"/>
-              </w:rPr>
-              <w:t xml:space="preserve"> </w:t>
-            </w:r>
-          </w:p>
-        </w:tc>
-        <w:tc>
-          <w:tcPr>
-            <w:tcW w:w="1031" w:type="dxa"/>
-            <w:tcBorders>
-              <w:top w:val="nil"/>
-              <w:left w:val="nil"/>
-              <w:bottom w:val="single" w:sz="6" w:space="0" w:color="000000"/>
-              <w:right w:val="nil"/>
-            </w:tcBorders>
-          </w:tcPr>
-          <w:p>
-            <w:pPr>
-              <w:spacing w:after="0" w:line="259" w:lineRule="auto"/>
-              <w:ind w:left="0" w:right="3" w:firstLine="0"/>
-              <w:jc w:val="right"/>
-            </w:pPr>
-            <w:r>
-              <w:t>2018</w:t>
+              <w:t>2016–2020</w:t>
             </w:r>
           </w:p>
         </w:tc>
@@ -540,13 +336,7 @@
           <w:rFonts w:cs="Aptos"/>
           <w:b/>
         </w:rPr>
-        <w:t>Centennial Teaching Assistant Award •  Stanford University</w:t>
-      </w:r>
-      <w:r>
-        <w:rPr>
-          <w:rFonts w:cs="Aptos"/>
-          <w:b/>
-        </w:rPr>
+        <w:t xml:space="preserve">Walter G. Gores Award for Excellence in Teaching •  Stanford University</w:t>
         <w:tab/>
       </w:r>
       <w:r>
@@ -578,7 +368,7 @@
           <w:i/>
           <w:iCs/>
         </w:rPr>
-        <w:t>The award recognizes teaching assistants who deserve special recognition for outstanding contributions to teaching</w:t>
+        <w:t>The university’s highest teaching award</w:t>
       </w:r>
     </w:p>
     <w:p>
@@ -601,49 +391,49 @@
         </w:tabs>
         <w:spacing w:after="0" w:line="259" w:lineRule="auto"/>
         <w:ind w:left="-15" w:right="-15" w:firstLine="0"/>
-      </w:pPr>
-      <w:r>
-        <w:rPr>
-          <w:rFonts w:cs="Aptos"/>
-          <w:b/>
-        </w:rPr>
-        <w:t xml:space="preserve">Institute for Research in the Social Sciences Dissertation Fellowship  •  Stanford University </w:t>
-      </w:r>
-      <w:r>
-        <w:rPr>
-          <w:rFonts w:cs="Aptos"/>
-          <w:b/>
-        </w:rPr>
+        <w:rPr>
+          <w:rFonts w:cs="Aptos"/>
+          <w:bCs/>
+        </w:rPr>
+      </w:pPr>
+      <w:r>
+        <w:rPr>
+          <w:rFonts w:cs="Aptos"/>
+          <w:b/>
+        </w:rPr>
+        <w:t>Centennial Teaching Assistant Award •  Stanford University</w:t>
         <w:tab/>
       </w:r>
       <w:r>
-        <w:t>2025</w:t>
-      </w:r>
-    </w:p>
-    <w:p>
-      <w:pPr>
-        <w:spacing w:after="4" w:line="250" w:lineRule="auto"/>
-        <w:ind w:left="-5" w:right="2783" w:hanging="10"/>
-      </w:pPr>
-      <w:r>
-        <w:rPr>
-          <w:rFonts w:cs="Aptos"/>
+        <w:rPr>
+          <w:rFonts w:cs="Aptos"/>
+          <w:bCs/>
+        </w:rPr>
+        <w:t>2026</w:t>
+      </w:r>
+    </w:p>
+    <w:p>
+      <w:pPr>
+        <w:tabs>
+          <w:tab w:val="right" w:pos="7290"/>
+        </w:tabs>
+        <w:spacing w:after="0" w:line="259" w:lineRule="auto"/>
+        <w:ind w:left="-15" w:right="2810" w:firstLine="0"/>
+        <w:rPr>
+          <w:rFonts w:cs="Aptos"/>
+          <w:bCs/>
           <w:i/>
-        </w:rPr>
-        <w:t>$11,000  •  Supports dissertation research that crosses disciplinary boundaries, and relies upon computational social science methods</w:t>
-      </w:r>
-      <w:r>
-        <w:t xml:space="preserve"> </w:t>
-      </w:r>
-    </w:p>
-    <w:p>
-      <w:pPr>
-        <w:spacing w:after="36" w:line="259" w:lineRule="auto"/>
-        <w:ind w:left="0" w:right="831" w:firstLine="0"/>
-        <w:jc w:val="right"/>
-      </w:pPr>
-      <w:r>
-        <w:t xml:space="preserve"> </w:t>
+          <w:iCs/>
+        </w:rPr>
+      </w:pPr>
+      <w:r>
+        <w:rPr>
+          <w:rFonts w:cs="Aptos"/>
+          <w:bCs/>
+          <w:i/>
+          <w:iCs/>
+        </w:rPr>
+        <w:t>The award recognizes teaching assistants who deserve special recognition for outstanding contributions to teaching</w:t>
       </w:r>
     </w:p>
     <w:p>
@@ -653,50 +443,11 @@
         </w:tabs>
         <w:spacing w:after="0" w:line="259" w:lineRule="auto"/>
         <w:ind w:left="-15" w:right="-15" w:firstLine="0"/>
-      </w:pPr>
-      <w:r>
-        <w:rPr>
-          <w:rFonts w:cs="Aptos"/>
-          <w:b/>
-        </w:rPr>
-        <w:t xml:space="preserve">Affective Science Graduate Student Fellowship  •  Stanford University </w:t>
-      </w:r>
-      <w:r>
-        <w:rPr>
-          <w:rFonts w:cs="Aptos"/>
-          <w:b/>
-        </w:rPr>
-        <w:tab/>
-      </w:r>
-      <w:r>
-        <w:t>2024</w:t>
-      </w:r>
-    </w:p>
-    <w:p>
-      <w:pPr>
-        <w:spacing w:after="4" w:line="250" w:lineRule="auto"/>
-        <w:ind w:left="-5" w:right="2783" w:hanging="10"/>
-      </w:pPr>
-      <w:r>
-        <w:rPr>
-          <w:rFonts w:cs="Aptos"/>
-          <w:i/>
-        </w:rPr>
-        <w:t>$5,000  •  Supports interdisciplinary research in affective science</w:t>
-      </w:r>
-      <w:r>
-        <w:t xml:space="preserve"> </w:t>
-      </w:r>
-    </w:p>
-    <w:p>
-      <w:pPr>
-        <w:spacing w:after="41" w:line="259" w:lineRule="auto"/>
-        <w:ind w:left="0" w:right="831" w:firstLine="0"/>
-        <w:jc w:val="right"/>
-      </w:pPr>
-      <w:r>
-        <w:t xml:space="preserve"> </w:t>
-      </w:r>
+        <w:rPr>
+          <w:rFonts w:cs="Aptos"/>
+          <w:b/>
+        </w:rPr>
+      </w:pPr>
     </w:p>
     <w:p>
       <w:pPr>
@@ -711,17 +462,11 @@
           <w:rFonts w:cs="Aptos"/>
           <w:b/>
         </w:rPr>
-        <w:t xml:space="preserve">Norman H. Anderson Award  •  Stanford University </w:t>
-      </w:r>
-      <w:r>
-        <w:rPr>
-          <w:rFonts w:cs="Aptos"/>
-          <w:b/>
-        </w:rPr>
+        <w:t xml:space="preserve">Institute for Research in the Social Sciences Dissertation Fellowship  •  Stanford University </w:t>
         <w:tab/>
       </w:r>
       <w:r>
-        <w:t>2021, 2023</w:t>
+        <w:t>2025</w:t>
       </w:r>
     </w:p>
     <w:p>
@@ -734,15 +479,15 @@
           <w:rFonts w:cs="Aptos"/>
           <w:i/>
         </w:rPr>
-        <w:t>$2,000  •  Supports research initiatives and studies for graduate students</w:t>
-      </w:r>
-      <w:r>
-        <w:t xml:space="preserve"> </w:t>
-      </w:r>
-    </w:p>
-    <w:p>
-      <w:pPr>
-        <w:spacing w:after="41" w:line="259" w:lineRule="auto"/>
+        <w:t>$11,000  •  Supports dissertation research that crosses disciplinary boundaries, and relies upon computational social science methods</w:t>
+      </w:r>
+      <w:r>
+        <w:t xml:space="preserve"> </w:t>
+      </w:r>
+    </w:p>
+    <w:p>
+      <w:pPr>
+        <w:spacing w:after="36" w:line="259" w:lineRule="auto"/>
         <w:ind w:left="0" w:right="831" w:firstLine="0"/>
         <w:jc w:val="right"/>
       </w:pPr>
@@ -763,17 +508,11 @@
           <w:rFonts w:cs="Aptos"/>
           <w:b/>
         </w:rPr>
-        <w:t xml:space="preserve">European Fellowship  •  Bryn Mawr College </w:t>
-      </w:r>
-      <w:r>
-        <w:rPr>
-          <w:rFonts w:cs="Aptos"/>
-          <w:b/>
-        </w:rPr>
+        <w:t xml:space="preserve">Affective Science Graduate Student Fellowship  •  Stanford University </w:t>
         <w:tab/>
       </w:r>
       <w:r>
-        <w:t>2020</w:t>
+        <w:t>2024</w:t>
       </w:r>
     </w:p>
     <w:p>
@@ -786,15 +525,15 @@
           <w:rFonts w:cs="Aptos"/>
           <w:i/>
         </w:rPr>
-        <w:t>$5,000  •  Highest academic prize awarded annually to one graduating senior with one of 10 highest GPAs</w:t>
-      </w:r>
-      <w:r>
-        <w:t xml:space="preserve"> </w:t>
-      </w:r>
-    </w:p>
-    <w:p>
-      <w:pPr>
-        <w:spacing w:after="37" w:line="259" w:lineRule="auto"/>
+        <w:t>$5,000  •  Supports interdisciplinary research in affective science</w:t>
+      </w:r>
+      <w:r>
+        <w:t xml:space="preserve"> </w:t>
+      </w:r>
+    </w:p>
+    <w:p>
+      <w:pPr>
+        <w:spacing w:after="41" w:line="259" w:lineRule="auto"/>
         <w:ind w:left="0" w:right="831" w:firstLine="0"/>
         <w:jc w:val="right"/>
       </w:pPr>
@@ -809,11 +548,44 @@
         </w:tabs>
         <w:spacing w:after="0" w:line="259" w:lineRule="auto"/>
         <w:ind w:left="-15" w:right="-15" w:firstLine="0"/>
-        <w:rPr>
-          <w:rFonts w:cs="Aptos"/>
-          <w:b/>
-        </w:rPr>
-      </w:pPr>
+      </w:pPr>
+      <w:r>
+        <w:rPr>
+          <w:rFonts w:cs="Aptos"/>
+          <w:b/>
+        </w:rPr>
+        <w:t xml:space="preserve">Norman H. Anderson Award  •  Stanford University </w:t>
+        <w:tab/>
+      </w:r>
+      <w:r>
+        <w:t>2021, 2023</w:t>
+      </w:r>
+    </w:p>
+    <w:p>
+      <w:pPr>
+        <w:spacing w:after="4" w:line="250" w:lineRule="auto"/>
+        <w:ind w:left="-5" w:right="2783" w:hanging="10"/>
+      </w:pPr>
+      <w:r>
+        <w:rPr>
+          <w:rFonts w:cs="Aptos"/>
+          <w:i/>
+        </w:rPr>
+        <w:t>$2,000  •  Supports research initiatives and studies for graduate students</w:t>
+      </w:r>
+      <w:r>
+        <w:t xml:space="preserve"> </w:t>
+      </w:r>
+    </w:p>
+    <w:p>
+      <w:pPr>
+        <w:spacing w:after="41" w:line="259" w:lineRule="auto"/>
+        <w:ind w:left="0" w:right="831" w:firstLine="0"/>
+        <w:jc w:val="right"/>
+      </w:pPr>
+      <w:r>
+        <w:t xml:space="preserve"> </w:t>
+      </w:r>
     </w:p>
     <w:p>
       <w:pPr>
@@ -822,11 +594,45 @@
         </w:tabs>
         <w:spacing w:after="0" w:line="259" w:lineRule="auto"/>
         <w:ind w:left="-15" w:right="-15" w:firstLine="0"/>
-        <w:rPr>
-          <w:rFonts w:cs="Aptos"/>
-          <w:b/>
-        </w:rPr>
-      </w:pPr>
+      </w:pPr>
+      <w:r>
+        <w:rPr>
+          <w:rFonts w:cs="Aptos"/>
+          <w:b/>
+        </w:rPr>
+        <w:t xml:space="preserve">European Fellowship  •  Bryn Mawr College </w:t>
+        <w:tab/>
+      </w:r>
+      <w:r>
+        <w:t>2020</w:t>
+      </w:r>
+    </w:p>
+    <w:p>
+      <w:pPr>
+        <w:spacing w:after="4" w:line="250" w:lineRule="auto"/>
+        <w:ind w:left="-5" w:right="2783" w:hanging="10"/>
+      </w:pPr>
+      <w:r>
+        <w:rPr>
+          <w:rFonts w:cs="Aptos"/>
+          <w:i/>
+        </w:rPr>
+        <w:t>$5,000  •  Highest academic prize awarded annually to one graduating senior with one of 10 highest GPAs</w:t>
+      </w:r>
+      <w:r>
+        <w:t xml:space="preserve"> </w:t>
+      </w:r>
+    </w:p>
+    <w:p>
+      <w:pPr>
+        <w:spacing w:after="37" w:line="259" w:lineRule="auto"/>
+        <w:ind w:left="0" w:right="831" w:firstLine="0"/>
+        <w:jc w:val="right"/>
+      </w:pPr>
+      <w:r>
+        <w:lastRenderedPageBreak/>
+        <w:t xml:space="preserve"> </w:t>
+      </w:r>
     </w:p>
     <w:p>
       <w:pPr>
@@ -841,14 +647,7 @@
           <w:rFonts w:cs="Aptos"/>
           <w:b/>
         </w:rPr>
-        <w:lastRenderedPageBreak/>
         <w:t xml:space="preserve">Community Building Honor Roll  •  Bryn Mawr College </w:t>
-      </w:r>
-      <w:r>
-        <w:rPr>
-          <w:rFonts w:cs="Aptos"/>
-          <w:b/>
-        </w:rPr>
         <w:tab/>
       </w:r>
       <w:r>
@@ -895,12 +694,6 @@
           <w:b/>
         </w:rPr>
         <w:t xml:space="preserve">Frances Velay Women’s Science Research Fellowship </w:t>
-      </w:r>
-      <w:r>
-        <w:rPr>
-          <w:rFonts w:cs="Aptos"/>
-          <w:b/>
-        </w:rPr>
         <w:tab/>
       </w:r>
       <w:r>
@@ -947,12 +740,6 @@
           <w:b/>
         </w:rPr>
         <w:t xml:space="preserve">Summer Science Research Grant  •  Bryn Mawr College </w:t>
-      </w:r>
-      <w:r>
-        <w:rPr>
-          <w:rFonts w:cs="Aptos"/>
-          <w:b/>
-        </w:rPr>
         <w:tab/>
       </w:r>
       <w:r>
@@ -1118,56 +905,41 @@
     </w:p>
     <w:p>
       <w:pPr>
+        <w:spacing w:after="120"/>
         <w:ind w:left="355"/>
       </w:pPr>
       <w:r>
         <w:rPr>
           <w:rFonts w:cs="Aptos"/>
-          <w:b/>
-        </w:rPr>
-        <w:t>Petrova, K.</w:t>
-      </w:r>
-      <w:r>
-        <w:rPr>
-          <w:rFonts w:cs="Aptos"/>
-        </w:rPr>
-        <w:t xml:space="preserve">, †Madibekov, N., Gerstenberg, T., &amp; Gross, J.J. (2026). What You See Is What You Regret. In </w:t>
-      </w:r>
-      <w:r>
-        <w:t>Proceedings of the 48</w:t>
-      </w:r>
-      <w:r>
-        <w:rPr>
-          <w:vertAlign w:val="superscript"/>
-        </w:rPr>
-        <w:t>th</w:t>
-      </w:r>
-      <w:r>
-        <w:t xml:space="preserve"> Annual Meeting of the Cognitive Science Society. </w:t>
-      </w:r>
-      <w:hyperlink r:id="rId8" w:history="1">
+        </w:rPr>
+        <w:t xml:space="preserve">†Kross Wallace, L., </w:t>
+      </w:r>
+      <w:r>
+        <w:rPr>
+          <w:rFonts w:cs="Aptos"/>
+          <w:b/>
+        </w:rPr>
+        <w:t xml:space="preserve">Petrova, K.</w:t>
+      </w:r>
+      <w:r>
+        <w:rPr>
+          <w:rFonts w:cs="Aptos"/>
+        </w:rPr>
+        <w:t xml:space="preserve">, &amp; Gross, J. J. (2026). “My Brain Doesn’t Speak That Language”: An Interpretative Phenomenological Analysis of Alexithymia in Autistic Women. Journal of Emotion and Psychopathology, 1(3), 64–81. </w:t>
+      </w:r>
+      <w:hyperlink r:id="rId30" w:history="1">
         <w:r>
           <w:rPr>
             <w:rStyle w:val="Hyperlink"/>
+            <w:rFonts w:cs="Aptos"/>
           </w:rPr>
-          <w:t>https://doi.org/10.31234/osf.io/raxge_v1</w:t>
+          <w:t>https://doi.org/10.55913/77fg3z82</w:t>
         </w:r>
       </w:hyperlink>
-      <w:r>
-        <w:t xml:space="preserve"> </w:t>
-      </w:r>
-    </w:p>
-    <w:p>
-      <w:pPr>
-        <w:ind w:left="0" w:firstLine="0"/>
-        <w:rPr>
-          <w:rFonts w:cs="Aptos"/>
-          <w:b/>
-        </w:rPr>
-      </w:pPr>
-    </w:p>
-    <w:p>
-      <w:pPr>
+    </w:p>
+    <w:p>
+      <w:pPr>
+        <w:spacing w:after="120"/>
         <w:ind w:left="355"/>
       </w:pPr>
       <w:r>
@@ -1175,93 +947,129 @@
           <w:rFonts w:cs="Aptos"/>
           <w:b/>
         </w:rPr>
-        <w:t>Petrova, K.</w:t>
-      </w:r>
-      <w:r>
-        <w:rPr>
-          <w:rFonts w:cs="Aptos"/>
-        </w:rPr>
-        <w:t xml:space="preserve">, Gross, J.J., &amp; Gerstenberg, T. (2025). Learning from “What might have been”: A Bayesian model of </w:t>
-      </w:r>
-      <w:r>
-        <w:t>learning from regret. In Proceedings of the 47</w:t>
-      </w:r>
-      <w:r>
-        <w:rPr>
-          <w:vertAlign w:val="superscript"/>
-        </w:rPr>
-        <w:t>th</w:t>
-      </w:r>
-      <w:r>
-        <w:t xml:space="preserve"> Annual Meeting of the Cognitive Science Society. </w:t>
-      </w:r>
-    </w:p>
-    <w:p>
-      <w:pPr>
-        <w:ind w:left="360" w:right="3" w:firstLine="0"/>
-      </w:pPr>
+        <w:t xml:space="preserve">Petrova, K.</w:t>
+      </w:r>
+      <w:r>
+        <w:rPr>
+          <w:rFonts w:cs="Aptos"/>
+        </w:rPr>
+        <w:t xml:space="preserve">, †Madibekov, N., Gerstenberg, T., &amp; Gross, J. J. (2026). What You See Is What You Regret. In Proceedings of the 48th Annual Meeting of the Cognitive Science Society. </w:t>
+      </w:r>
+      <w:hyperlink r:id="rId31" w:history="1">
+        <w:r>
+          <w:rPr>
+            <w:rStyle w:val="Hyperlink"/>
+            <w:rFonts w:cs="Aptos"/>
+          </w:rPr>
+          <w:t>https://escholarship.org/uc/item/2rh0g87t</w:t>
+        </w:r>
+      </w:hyperlink>
+    </w:p>
+    <w:p>
+      <w:pPr>
+        <w:spacing w:after="120"/>
+        <w:ind w:left="355"/>
+      </w:pPr>
+      <w:r>
+        <w:rPr>
+          <w:rFonts w:cs="Aptos"/>
+        </w:rPr>
+        <w:t xml:space="preserve">Williams, A. J., Rhodes, C. A., Cleare, S., Borschmann, R., Gross, J. J., </w:t>
+      </w:r>
+      <w:r>
+        <w:rPr>
+          <w:rFonts w:cs="Aptos"/>
+          <w:b/>
+        </w:rPr>
+        <w:t xml:space="preserve">Petrova, K.</w:t>
+      </w:r>
+      <w:r>
+        <w:rPr>
+          <w:rFonts w:cs="Aptos"/>
+        </w:rPr>
+        <w:t xml:space="preserve">, Posada, L., Tench, C. R., Chapman-Nisar, A., Martin, L., Hollis, C., Townsend, E., &amp; Slovak, P. (2026). A Socially Assistive Robot to Support Mental Wellbeing in LGBTQ+ Young People at Risk of Self-Harm: A Randomized Controlled Trial. Nature Medicine, 32(6), 2267–2276. </w:t>
+      </w:r>
+      <w:hyperlink r:id="rId32" w:history="1">
+        <w:r>
+          <w:rPr>
+            <w:rStyle w:val="Hyperlink"/>
+            <w:rFonts w:cs="Aptos"/>
+          </w:rPr>
+          <w:t>https://doi.org/10.1038/s41591-026-04422-6</w:t>
+        </w:r>
+      </w:hyperlink>
+    </w:p>
+    <w:p>
+      <w:pPr>
+        <w:spacing w:after="120"/>
+        <w:ind w:left="355"/>
+      </w:pPr>
+      <w:r>
+        <w:rPr>
+          <w:rFonts w:cs="Aptos"/>
+        </w:rPr>
+        <w:t xml:space="preserve">Behnke, M., Krzyżaniak, W., Nowak, J., Kupiński, S., Chwiłkowska, P., Jęśko Białek, S., Kłoskowski, M., Maciejewski, P., Szymański, K., Lakens, D., </w:t>
+      </w:r>
+      <w:r>
+        <w:rPr>
+          <w:rFonts w:cs="Aptos"/>
+          <w:b/>
+        </w:rPr>
+        <w:t xml:space="preserve">Petrova, K.</w:t>
+      </w:r>
+      <w:r>
+        <w:rPr>
+          <w:rFonts w:cs="Aptos"/>
+        </w:rPr>
+        <w:t xml:space="preserve">, Jamieson, J. P., &amp; Gross, J. J. (2025). The Competitive Esports Physiological, Affective, and Video Dataset. Scientific Data, 12(1), 56. </w:t>
+      </w:r>
+      <w:hyperlink r:id="rId33" w:history="1">
+        <w:r>
+          <w:rPr>
+            <w:rStyle w:val="Hyperlink"/>
+            <w:rFonts w:cs="Aptos"/>
+          </w:rPr>
+          <w:t>https://doi.org/10.1038/s41597-024-04364-z</w:t>
+        </w:r>
+      </w:hyperlink>
+    </w:p>
+    <w:p>
+      <w:pPr>
+        <w:spacing w:after="120"/>
+        <w:ind w:left="355"/>
+      </w:pPr>
+      <w:r>
+        <w:rPr>
+          <w:rFonts w:cs="Aptos"/>
+          <w:b/>
+        </w:rPr>
+        <w:t xml:space="preserve">Petrova, K.</w:t>
+      </w:r>
+      <w:r>
+        <w:rPr>
+          <w:rFonts w:cs="Aptos"/>
+        </w:rPr>
+        <w:t xml:space="preserve">, Gross, J. J., &amp; Gerstenberg, T. (2025). Learning From “What Might Have Been”: A Bayesian Model of Learning From Regret. In Proceedings of the 47th Annual Meeting of the Cognitive Science Society (pp. 5845–5851). </w:t>
+      </w:r>
       <w:hyperlink r:id="rId9" w:history="1">
         <w:r>
           <w:rPr>
             <w:rStyle w:val="Hyperlink"/>
+            <w:rFonts w:cs="Aptos"/>
           </w:rPr>
           <w:t>https://escholarship.org/uc/item/3zv3g7xg</w:t>
         </w:r>
       </w:hyperlink>
-      <w:r>
-        <w:t xml:space="preserve">    </w:t>
-      </w:r>
-    </w:p>
-    <w:p>
-      <w:pPr>
-        <w:spacing w:after="26" w:line="259" w:lineRule="auto"/>
-        <w:ind w:left="0" w:firstLine="0"/>
-      </w:pPr>
-      <w:r>
-        <w:t xml:space="preserve"> </w:t>
-      </w:r>
-    </w:p>
-    <w:p>
-      <w:pPr>
+    </w:p>
+    <w:p>
+      <w:pPr>
+        <w:spacing w:after="120"/>
         <w:ind w:left="355"/>
       </w:pPr>
       <w:r>
         <w:rPr>
           <w:rFonts w:cs="Aptos"/>
         </w:rPr>
-        <w:t xml:space="preserve">†Kross Wallace, L., </w:t>
-      </w:r>
-      <w:r>
-        <w:rPr>
-          <w:rFonts w:cs="Aptos"/>
-          <w:b/>
-        </w:rPr>
-        <w:t>Petrova, K.</w:t>
-      </w:r>
-      <w:r>
-        <w:rPr>
-          <w:rFonts w:cs="Aptos"/>
-        </w:rPr>
-        <w:t xml:space="preserve">, &amp; Gross, J.J. (in press). “My Brain Doesn’t Speak That Language:” An Interpretative </w:t>
-      </w:r>
-      <w:r>
-        <w:t xml:space="preserve">Phenomenological Analysis of Alexithymia in Autistic Women. Journal of Emotion and Psychopathology. </w:t>
-      </w:r>
-    </w:p>
-    <w:p>
-      <w:pPr>
-        <w:spacing w:after="32" w:line="259" w:lineRule="auto"/>
-        <w:ind w:left="0" w:firstLine="0"/>
-      </w:pPr>
-      <w:r>
-        <w:t xml:space="preserve"> </w:t>
-      </w:r>
-    </w:p>
-    <w:p>
-      <w:pPr>
-        <w:ind w:left="355" w:right="3"/>
-      </w:pPr>
-      <w:r>
         <w:t xml:space="preserve">Petter, J., Mehta, A., </w:t>
       </w:r>
       <w:r>
@@ -1269,58 +1077,33 @@
           <w:rFonts w:cs="Aptos"/>
           <w:b/>
         </w:rPr>
-        <w:t>Petrova, K.</w:t>
-      </w:r>
-      <w:r>
-        <w:t xml:space="preserve">, Kindt, M., </w:t>
-      </w:r>
-      <w:proofErr w:type="spellStart"/>
-      <w:r>
-        <w:t>Sheppes</w:t>
-      </w:r>
-      <w:proofErr w:type="spellEnd"/>
-      <w:r>
-        <w:t xml:space="preserve">, G., </w:t>
-      </w:r>
-      <w:proofErr w:type="spellStart"/>
-      <w:r>
-        <w:t>Haslbeck</w:t>
-      </w:r>
-      <w:proofErr w:type="spellEnd"/>
-      <w:r>
-        <w:t xml:space="preserve">, J. M. B., &amp; Gross, J. J. (2025). Emotion regulation, fast or slow: A computational model of strategy choice. Emotion. Advance online publication. </w:t>
-      </w:r>
-    </w:p>
-    <w:p>
-      <w:pPr>
-        <w:ind w:left="360" w:right="3" w:firstLine="0"/>
-      </w:pPr>
+        <w:t xml:space="preserve">Petrova, K.</w:t>
+      </w:r>
+      <w:r>
+        <w:rPr>
+          <w:rFonts w:cs="Aptos"/>
+        </w:rPr>
+        <w:t xml:space="preserve">, Kindt, M., Sheppes, G., Haslbeck, J. M. B., &amp; Gross, J. J. (2025). Emotion Regulation, Fast or Slow: A Computational Model of Strategy Choice. Emotion, 25(5), 1273–1292. </w:t>
+      </w:r>
       <w:hyperlink r:id="rId10" w:history="1">
         <w:r>
           <w:rPr>
             <w:rStyle w:val="Hyperlink"/>
+            <w:rFonts w:cs="Aptos"/>
           </w:rPr>
           <w:t>https://doi.org/10.1037/emo0001471</w:t>
         </w:r>
       </w:hyperlink>
-      <w:r>
-        <w:t xml:space="preserve">  </w:t>
-      </w:r>
-    </w:p>
-    <w:p>
-      <w:pPr>
-        <w:spacing w:after="31" w:line="259" w:lineRule="auto"/>
-        <w:ind w:left="0" w:firstLine="0"/>
-      </w:pPr>
-      <w:r>
-        <w:t xml:space="preserve"> </w:t>
-      </w:r>
-    </w:p>
-    <w:p>
-      <w:pPr>
-        <w:ind w:left="355" w:right="3"/>
-      </w:pPr>
-      <w:r>
+    </w:p>
+    <w:p>
+      <w:pPr>
+        <w:spacing w:after="120"/>
+        <w:ind w:left="355"/>
+      </w:pPr>
+      <w:r>
+        <w:rPr>
+          <w:rFonts w:cs="Aptos"/>
+        </w:rPr>
         <w:t xml:space="preserve">Salias, C., Gross, J. J., </w:t>
       </w:r>
       <w:r>
@@ -1328,302 +1111,321 @@
           <w:rFonts w:cs="Aptos"/>
           <w:b/>
         </w:rPr>
-        <w:t>Petrova, K.</w:t>
-      </w:r>
-      <w:r>
-        <w:t xml:space="preserve">, Forbush, K. T., &amp; Preece, D. A. (2025). Eating disorder symptoms and profiles of emotion regulation strategy use. Journal of Affective Disorders, 380, 94-103. </w:t>
-      </w:r>
-    </w:p>
-    <w:p>
-      <w:pPr>
-        <w:ind w:left="360" w:right="3" w:firstLine="0"/>
-      </w:pPr>
+        <w:t xml:space="preserve">Petrova, K.</w:t>
+      </w:r>
+      <w:r>
+        <w:rPr>
+          <w:rFonts w:cs="Aptos"/>
+        </w:rPr>
+        <w:t xml:space="preserve">, Forbush, K. T., &amp; Preece, D. A. (2025). Eating Disorder Symptoms and Profiles of Emotion Regulation Strategy Use. Journal of Affective Disorders, 380, 94–103. </w:t>
+      </w:r>
       <w:hyperlink r:id="rId11" w:history="1">
         <w:r>
           <w:rPr>
             <w:rStyle w:val="Hyperlink"/>
+            <w:rFonts w:cs="Aptos"/>
           </w:rPr>
           <w:t>https://doi.org/10.1016/j.jad.2025.03.050</w:t>
         </w:r>
       </w:hyperlink>
-      <w:r>
-        <w:t xml:space="preserve">  </w:t>
-      </w:r>
-    </w:p>
-    <w:p>
-      <w:pPr>
-        <w:spacing w:after="26" w:line="259" w:lineRule="auto"/>
-        <w:ind w:left="0" w:firstLine="0"/>
-      </w:pPr>
-      <w:r>
-        <w:t xml:space="preserve"> </w:t>
-      </w:r>
-    </w:p>
-    <w:p>
-      <w:pPr>
-        <w:ind w:left="355" w:right="3"/>
-      </w:pPr>
-      <w:r>
-        <w:rPr>
-          <w:rFonts w:cs="Aptos"/>
-          <w:b/>
-        </w:rPr>
-        <w:t>Petrova, K.</w:t>
-      </w:r>
-      <w:r>
-        <w:t xml:space="preserve">, Nevarez, M. D., Waldinger, R. J., &amp; Schulz, M. S. (2024). Emotional support across adulthood: A 60-year </w:t>
-      </w:r>
-      <w:r>
-        <w:rPr>
-          <w:rFonts w:cs="Aptos"/>
-        </w:rPr>
-        <w:t xml:space="preserve">study of men’s social networks. Psychology and Aging. Advance online publication. </w:t>
-      </w:r>
-    </w:p>
-    <w:p>
-      <w:pPr>
-        <w:ind w:left="360" w:right="3" w:firstLine="0"/>
-      </w:pPr>
+    </w:p>
+    <w:p>
+      <w:pPr>
+        <w:spacing w:after="120"/>
+        <w:ind w:left="355"/>
+      </w:pPr>
+      <w:r>
+        <w:rPr>
+          <w:rFonts w:cs="Aptos"/>
+        </w:rPr>
+        <w:t xml:space="preserve">Behnke, M., Lakens, D., </w:t>
+      </w:r>
+      <w:r>
+        <w:rPr>
+          <w:rFonts w:cs="Aptos"/>
+          <w:b/>
+        </w:rPr>
+        <w:t xml:space="preserve">Petrova, K.</w:t>
+      </w:r>
+      <w:r>
+        <w:rPr>
+          <w:rFonts w:cs="Aptos"/>
+        </w:rPr>
+        <w:t xml:space="preserve">, Chwiłkowska, P., Jęśko Białek, S., Kłoskowski, M., Krzyżaniak, W., Maciejewski, P., Kaczmarek, L. D., Szymański, K., Jamieson, J. P., &amp; Gross, J. J. (2024). Applying a Synergistic Mindsets Intervention to an Esports Context. Royal Society Open Science, 11(6), 240691. </w:t>
+      </w:r>
+      <w:hyperlink r:id="rId34" w:history="1">
+        <w:r>
+          <w:rPr>
+            <w:rStyle w:val="Hyperlink"/>
+            <w:rFonts w:cs="Aptos"/>
+          </w:rPr>
+          <w:t>https://doi.org/10.1098/rsos.240691</w:t>
+        </w:r>
+      </w:hyperlink>
+    </w:p>
+    <w:p>
+      <w:pPr>
+        <w:spacing w:after="120"/>
+        <w:ind w:left="355"/>
+      </w:pPr>
+      <w:r>
+        <w:rPr>
+          <w:rFonts w:cs="Aptos"/>
+        </w:rPr>
+        <w:t xml:space="preserve">Johnston, T. E., </w:t>
+      </w:r>
+      <w:r>
+        <w:rPr>
+          <w:rFonts w:cs="Aptos"/>
+          <w:b/>
+        </w:rPr>
+        <w:t xml:space="preserve">Petrova, K.</w:t>
+      </w:r>
+      <w:r>
+        <w:rPr>
+          <w:rFonts w:cs="Aptos"/>
+        </w:rPr>
+        <w:t xml:space="preserve">, Mehta, A., Gross, J. J., McEvoy, P., &amp; Preece, D. A. (2024). The Role of Emotion Beliefs in Depression, Anxiety, and Stress. Australian Psychologist, 59(4), 367–376. </w:t>
+      </w:r>
+      <w:hyperlink r:id="rId14" w:history="1">
+        <w:r>
+          <w:rPr>
+            <w:rStyle w:val="Hyperlink"/>
+            <w:rFonts w:cs="Aptos"/>
+          </w:rPr>
+          <w:t>https://doi.org/10.1080/00050067.2023.2290734</w:t>
+        </w:r>
+      </w:hyperlink>
+    </w:p>
+    <w:p>
+      <w:pPr>
+        <w:spacing w:after="120"/>
+        <w:ind w:left="355"/>
+      </w:pPr>
+      <w:r>
+        <w:rPr>
+          <w:rFonts w:cs="Aptos"/>
+          <w:b/>
+        </w:rPr>
+        <w:t xml:space="preserve">Petrova, K.</w:t>
+      </w:r>
+      <w:r>
+        <w:rPr>
+          <w:rFonts w:cs="Aptos"/>
+        </w:rPr>
+        <w:t xml:space="preserve">, Nevarez, M. D., Waldinger, R. J., &amp; Schulz, M. S. (2024). Emotional Support Across Adulthood: A 60-Year Study of Men’s Social Networks. Psychology and Aging, 39(8), 933–945. </w:t>
+      </w:r>
       <w:hyperlink r:id="rId12" w:history="1">
         <w:r>
           <w:rPr>
             <w:rStyle w:val="Hyperlink"/>
+            <w:rFonts w:cs="Aptos"/>
           </w:rPr>
           <w:t>https://doi.org/10.1037/pag0000843</w:t>
         </w:r>
       </w:hyperlink>
-      <w:r>
-        <w:t xml:space="preserve">  </w:t>
-      </w:r>
-    </w:p>
-    <w:p>
-      <w:pPr>
-        <w:spacing w:after="32" w:line="259" w:lineRule="auto"/>
-        <w:ind w:left="0" w:firstLine="0"/>
-      </w:pPr>
-      <w:r>
-        <w:t xml:space="preserve"> </w:t>
-      </w:r>
-    </w:p>
-    <w:p>
-      <w:pPr>
+    </w:p>
+    <w:p>
+      <w:pPr>
+        <w:spacing w:after="120"/>
         <w:ind w:left="355"/>
       </w:pPr>
       <w:r>
         <w:rPr>
           <w:rFonts w:cs="Aptos"/>
-        </w:rPr>
-        <w:t xml:space="preserve">Behnke M., </w:t>
-      </w:r>
-      <w:proofErr w:type="spellStart"/>
-      <w:r>
-        <w:rPr>
-          <w:rFonts w:cs="Aptos"/>
-        </w:rPr>
-        <w:t>Lakens</w:t>
-      </w:r>
-      <w:proofErr w:type="spellEnd"/>
-      <w:r>
-        <w:rPr>
-          <w:rFonts w:cs="Aptos"/>
-        </w:rPr>
-        <w:t xml:space="preserve"> D., Petrova K., </w:t>
-      </w:r>
-      <w:proofErr w:type="spellStart"/>
-      <w:r>
-        <w:rPr>
-          <w:rFonts w:cs="Aptos"/>
-        </w:rPr>
-        <w:t>Chwiłkowska</w:t>
-      </w:r>
-      <w:proofErr w:type="spellEnd"/>
-      <w:r>
-        <w:rPr>
-          <w:rFonts w:cs="Aptos"/>
-        </w:rPr>
-        <w:t xml:space="preserve"> P., Kaczmarek L. D., Jamieson J. P., &amp; Gross J. J. (2023) Optimizing </w:t>
-      </w:r>
-      <w:r>
-        <w:t xml:space="preserve">Esports Performance Using a Synergistic Mindsets Intervention. In principle acceptance of Version 3 by Peer </w:t>
-      </w:r>
-    </w:p>
-    <w:p>
-      <w:pPr>
-        <w:ind w:left="360" w:right="3" w:firstLine="0"/>
-      </w:pPr>
-      <w:r>
-        <w:t xml:space="preserve">Community in Registered Reports. </w:t>
-      </w:r>
-      <w:hyperlink r:id="rId13" w:history="1">
-        <w:r>
-          <w:rPr>
-            <w:rStyle w:val="Hyperlink"/>
-          </w:rPr>
-          <w:t>https://osf.io/z3adb</w:t>
-        </w:r>
-      </w:hyperlink>
-      <w:r>
-        <w:t xml:space="preserve"> </w:t>
-      </w:r>
-      <w:r>
-        <w:t xml:space="preserve"> </w:t>
-      </w:r>
-    </w:p>
-    <w:p>
-      <w:pPr>
-        <w:spacing w:after="31" w:line="259" w:lineRule="auto"/>
-        <w:ind w:left="0" w:firstLine="0"/>
-      </w:pPr>
-      <w:r>
-        <w:t xml:space="preserve"> </w:t>
-      </w:r>
-    </w:p>
-    <w:p>
-      <w:pPr>
-        <w:ind w:left="355" w:right="3"/>
-      </w:pPr>
-      <w:r>
-        <w:t xml:space="preserve">Johnston, T. E., </w:t>
-      </w:r>
-      <w:r>
-        <w:rPr>
-          <w:rFonts w:cs="Aptos"/>
-          <w:b/>
-        </w:rPr>
-        <w:t>Petrova, K.</w:t>
-      </w:r>
-      <w:r>
-        <w:t xml:space="preserve">, Mehta, A., Gross, J. J., McEvoy, P., &amp; Preece, D. A. (2023). The role of emotion beliefs in depression, anxiety, and stress. Australian Psychologist, 1-10. </w:t>
-      </w:r>
-      <w:hyperlink r:id="rId14" w:history="1">
-        <w:r>
-          <w:rPr>
-            <w:rStyle w:val="Hyperlink"/>
-          </w:rPr>
-          <w:t>https://doi.org/10.1080/00050067.2023.2290734</w:t>
-        </w:r>
-      </w:hyperlink>
-      <w:r>
-        <w:t xml:space="preserve"> </w:t>
-      </w:r>
-      <w:r>
-        <w:t xml:space="preserve"> </w:t>
-      </w:r>
-    </w:p>
-    <w:p>
-      <w:pPr>
-        <w:spacing w:after="27" w:line="259" w:lineRule="auto"/>
-        <w:ind w:left="0" w:firstLine="0"/>
-      </w:pPr>
-      <w:r>
-        <w:t xml:space="preserve"> </w:t>
-      </w:r>
-    </w:p>
-    <w:p>
-      <w:pPr>
-        <w:ind w:left="355"/>
-      </w:pPr>
-      <w:r>
-        <w:rPr>
-          <w:rFonts w:cs="Aptos"/>
-          <w:b/>
-        </w:rPr>
-        <w:t>Petrova, K.</w:t>
-      </w:r>
-      <w:r>
-        <w:rPr>
-          <w:rFonts w:cs="Aptos"/>
-        </w:rPr>
-        <w:t xml:space="preserve">, †Zielke, J. N., Mehta, A., &amp; Gross, J. J. (2023). Occurrent beliefs about emotions predict emotion </w:t>
-      </w:r>
-      <w:r>
-        <w:t xml:space="preserve">regulation in everyday life. Emotion. </w:t>
+          <w:b/>
+        </w:rPr>
+        <w:t xml:space="preserve">Petrova, K.</w:t>
+      </w:r>
+      <w:r>
+        <w:rPr>
+          <w:rFonts w:cs="Aptos"/>
+        </w:rPr>
+        <w:t xml:space="preserve">, †Zielke, J. N., Mehta, A., &amp; Gross, J. J. (2024). Occurrent Beliefs About Emotions Predict Emotion Regulation in Everyday Life. Emotion, 24(4), 992–1002. </w:t>
       </w:r>
       <w:hyperlink r:id="rId15" w:history="1">
         <w:r>
           <w:rPr>
             <w:rStyle w:val="Hyperlink"/>
+            <w:rFonts w:cs="Aptos"/>
           </w:rPr>
           <w:t>https://doi.org/10.1037/emo0001317</w:t>
         </w:r>
       </w:hyperlink>
-      <w:r>
-        <w:t xml:space="preserve"> </w:t>
-      </w:r>
-      <w:r>
-        <w:t xml:space="preserve"> </w:t>
-      </w:r>
-    </w:p>
-    <w:p>
-      <w:pPr>
-        <w:spacing w:after="31" w:line="259" w:lineRule="auto"/>
-        <w:ind w:left="0" w:firstLine="0"/>
-      </w:pPr>
-      <w:r>
-        <w:t xml:space="preserve"> </w:t>
-      </w:r>
-    </w:p>
-    <w:p>
-      <w:pPr>
-        <w:ind w:left="-15" w:right="3" w:firstLine="0"/>
-        <w:rPr>
-          <w:rFonts w:cs="Aptos"/>
-          <w:b/>
-        </w:rPr>
-      </w:pPr>
-    </w:p>
-    <w:p>
-      <w:pPr>
-        <w:ind w:left="-15" w:right="3" w:firstLine="0"/>
-      </w:pPr>
-      <w:r>
-        <w:rPr>
-          <w:rFonts w:cs="Aptos"/>
-          <w:b/>
-        </w:rPr>
-        <w:t>Petrova, K.</w:t>
-      </w:r>
-      <w:r>
-        <w:t xml:space="preserve">, &amp; Gross, J. J. (2023). The future of emotion regulation research: Broadening our field of view. Affective </w:t>
-      </w:r>
-    </w:p>
-    <w:p>
-      <w:pPr>
-        <w:ind w:left="360" w:right="3" w:firstLine="0"/>
-      </w:pPr>
-      <w:r>
-        <w:lastRenderedPageBreak/>
-        <w:t xml:space="preserve">Science, 4(4), 609-616. </w:t>
+    </w:p>
+    <w:p>
+      <w:pPr>
+        <w:spacing w:after="120"/>
+        <w:ind w:left="355"/>
+      </w:pPr>
+      <w:r>
+        <w:rPr>
+          <w:rFonts w:cs="Aptos"/>
+        </w:rPr>
+        <w:t xml:space="preserve">Preece, D. A., Mehta, A., </w:t>
+      </w:r>
+      <w:r>
+        <w:rPr>
+          <w:rFonts w:cs="Aptos"/>
+          <w:b/>
+        </w:rPr>
+        <w:t xml:space="preserve">Petrova, K.</w:t>
+      </w:r>
+      <w:r>
+        <w:rPr>
+          <w:rFonts w:cs="Aptos"/>
+        </w:rPr>
+        <w:t xml:space="preserve">, Sikka, P., Pemberton, E., &amp; Gross, J. J. (2024). Alexithymia Profiles and Depression, Anxiety, and Stress. Journal of Affective Disorders, 357, 116–125. </w:t>
+      </w:r>
+      <w:hyperlink r:id="rId35" w:history="1">
+        <w:r>
+          <w:rPr>
+            <w:rStyle w:val="Hyperlink"/>
+            <w:rFonts w:cs="Aptos"/>
+          </w:rPr>
+          <w:t>https://doi.org/10.1016/j.jad.2024.02.071</w:t>
+        </w:r>
+      </w:hyperlink>
+    </w:p>
+    <w:p>
+      <w:pPr>
+        <w:spacing w:after="120"/>
+        <w:ind w:left="355"/>
+      </w:pPr>
+      <w:r>
+        <w:rPr>
+          <w:rFonts w:cs="Aptos"/>
+        </w:rPr>
+        <w:t xml:space="preserve">Preece, D. A., </w:t>
+      </w:r>
+      <w:r>
+        <w:rPr>
+          <w:rFonts w:cs="Aptos"/>
+          <w:b/>
+        </w:rPr>
+        <w:t xml:space="preserve">Petrova, K.</w:t>
+      </w:r>
+      <w:r>
+        <w:rPr>
+          <w:rFonts w:cs="Aptos"/>
+        </w:rPr>
+        <w:t xml:space="preserve">, Mehta, A., Sikka, P., &amp; Gross, J. J. (2024). Alexithymia or General Psychological Distress? Discriminant Validity of the Toronto Alexithymia Scale and the Perth Alexithymia Questionnaire. Journal of Affective Disorders, 352, 140–145. </w:t>
+      </w:r>
+      <w:hyperlink r:id="rId36" w:history="1">
+        <w:r>
+          <w:rPr>
+            <w:rStyle w:val="Hyperlink"/>
+            <w:rFonts w:cs="Aptos"/>
+          </w:rPr>
+          <w:t>https://doi.org/10.1016/j.jad.2024.01.271</w:t>
+        </w:r>
+      </w:hyperlink>
+    </w:p>
+    <w:p>
+      <w:pPr>
+        <w:spacing w:after="120"/>
+        <w:ind w:left="355"/>
+      </w:pPr>
+      <w:r>
+        <w:rPr>
+          <w:rFonts w:cs="Aptos"/>
+          <w:b/>
+        </w:rPr>
+        <w:t xml:space="preserve">Petrova, K.</w:t>
+      </w:r>
+      <w:r>
+        <w:rPr>
+          <w:rFonts w:cs="Aptos"/>
+        </w:rPr>
+        <w:t xml:space="preserve">, &amp; Gross, J. J. (2023). The Future of Emotion Regulation Research: Broadening Our Field of View. Affective Science, 4(4), 609–616. </w:t>
       </w:r>
       <w:hyperlink r:id="rId16" w:history="1">
         <w:r>
           <w:rPr>
             <w:rStyle w:val="Hyperlink"/>
+            <w:rFonts w:cs="Aptos"/>
           </w:rPr>
           <w:t>https://doi.org/10.1007/s42761-023-00222-0</w:t>
         </w:r>
       </w:hyperlink>
-      <w:r>
-        <w:t xml:space="preserve"> </w:t>
-      </w:r>
-      <w:r>
-        <w:t xml:space="preserve"> </w:t>
-      </w:r>
-    </w:p>
-    <w:p>
-      <w:pPr>
-        <w:spacing w:after="27" w:line="259" w:lineRule="auto"/>
-        <w:ind w:left="0" w:firstLine="0"/>
-      </w:pPr>
-      <w:r>
-        <w:t xml:space="preserve"> </w:t>
-      </w:r>
-    </w:p>
-    <w:p>
-      <w:pPr>
-        <w:ind w:left="355" w:right="3"/>
-      </w:pPr>
-      <w:r>
+    </w:p>
+    <w:p>
+      <w:pPr>
+        <w:spacing w:after="120"/>
+        <w:ind w:left="355"/>
+      </w:pPr>
+      <w:r>
+        <w:rPr>
+          <w:rFonts w:cs="Aptos"/>
+        </w:rPr>
+        <w:t xml:space="preserve">Preece, D. A., Mehta, A., </w:t>
+      </w:r>
+      <w:r>
+        <w:rPr>
+          <w:rFonts w:cs="Aptos"/>
+          <w:b/>
+        </w:rPr>
+        <w:t xml:space="preserve">Petrova, K.</w:t>
+      </w:r>
+      <w:r>
+        <w:rPr>
+          <w:rFonts w:cs="Aptos"/>
+        </w:rPr>
+        <w:t xml:space="preserve">, Sikka, P., Bjureberg, J., Becerra, R., &amp; Gross, J. J. (2023). Alexithymia and Emotion Regulation. Journal of Affective Disorders, 324, 232–238. </w:t>
+      </w:r>
+      <w:hyperlink r:id="rId19" w:history="1">
+        <w:r>
+          <w:rPr>
+            <w:rStyle w:val="Hyperlink"/>
+            <w:rFonts w:cs="Aptos"/>
+          </w:rPr>
+          <w:t>https://doi.org/10.1016/j.jad.2022.12.065</w:t>
+        </w:r>
+      </w:hyperlink>
+    </w:p>
+    <w:p>
+      <w:pPr>
+        <w:spacing w:after="120"/>
+        <w:ind w:left="355"/>
+      </w:pPr>
+      <w:r>
+        <w:rPr>
+          <w:rFonts w:cs="Aptos"/>
+        </w:rPr>
+        <w:t xml:space="preserve">Preece, D. A., Mehta, A., </w:t>
+      </w:r>
+      <w:r>
+        <w:rPr>
+          <w:rFonts w:cs="Aptos"/>
+          <w:b/>
+        </w:rPr>
+        <w:t xml:space="preserve">Petrova, K.</w:t>
+      </w:r>
+      <w:r>
+        <w:rPr>
+          <w:rFonts w:cs="Aptos"/>
+        </w:rPr>
+        <w:t xml:space="preserve">, Sikka, P., Bjureberg, J., Chen, W., Becerra, R., Allan, A., Robinson, K., &amp; Gross, J. J. (2023). The Perth Alexithymia Questionnaire-Short Form (PAQ-S): A 6-Item Measure of Alexithymia. Journal of Affective Disorders, 325, 493–501. </w:t>
+      </w:r>
+      <w:hyperlink r:id="rId18" w:history="1">
+        <w:r>
+          <w:rPr>
+            <w:rStyle w:val="Hyperlink"/>
+            <w:rFonts w:cs="Aptos"/>
+          </w:rPr>
+          <w:t>https://doi.org/10.1016/j.jad.2023.01.036</w:t>
+        </w:r>
+      </w:hyperlink>
+    </w:p>
+    <w:p>
+      <w:pPr>
+        <w:spacing w:after="120"/>
+        <w:ind w:left="355"/>
+      </w:pPr>
+      <w:r>
+        <w:rPr>
+          <w:rFonts w:cs="Aptos"/>
+        </w:rPr>
         <w:t xml:space="preserve">Preece, D. A., </w:t>
       </w:r>
       <w:r>
@@ -1631,243 +1433,107 @@
           <w:rFonts w:cs="Aptos"/>
           <w:b/>
         </w:rPr>
-        <w:t>Petrova, K.</w:t>
-      </w:r>
-      <w:r>
-        <w:t>, Mehta, A., &amp; Gross, J. J. (2023). The Emotion Regulation Questionnaire-Short Form (ERQ-S): A 6-item measure of cognitive reappraisal and expressive suppression. Journal of Affective Disorders, 340, 855-</w:t>
-      </w:r>
-    </w:p>
-    <w:p>
-      <w:pPr>
-        <w:ind w:left="360" w:right="3" w:firstLine="0"/>
-      </w:pPr>
-      <w:r>
-        <w:t xml:space="preserve">861. </w:t>
+        <w:t xml:space="preserve">Petrova, K.</w:t>
+      </w:r>
+      <w:r>
+        <w:rPr>
+          <w:rFonts w:cs="Aptos"/>
+        </w:rPr>
+        <w:t xml:space="preserve">, Mehta, A., &amp; Gross, J. J. (2023). The Emotion Regulation Questionnaire-Short Form (ERQ-S): A 6-Item Measure of Cognitive Reappraisal and Expressive Suppression. Journal of Affective Disorders, 340, 855–861. </w:t>
       </w:r>
       <w:hyperlink r:id="rId17" w:history="1">
         <w:r>
           <w:rPr>
             <w:rStyle w:val="Hyperlink"/>
+            <w:rFonts w:cs="Aptos"/>
           </w:rPr>
           <w:t>https://doi.org/10.1016/j.jad.2023.08.076</w:t>
         </w:r>
       </w:hyperlink>
-      <w:r>
-        <w:t xml:space="preserve"> </w:t>
-      </w:r>
-      <w:r>
-        <w:t xml:space="preserve"> </w:t>
-      </w:r>
-    </w:p>
-    <w:p>
-      <w:pPr>
-        <w:spacing w:after="31" w:line="259" w:lineRule="auto"/>
-        <w:ind w:left="0" w:firstLine="0"/>
-      </w:pPr>
-      <w:r>
-        <w:t xml:space="preserve"> </w:t>
-      </w:r>
-    </w:p>
-    <w:p>
-      <w:pPr>
-        <w:ind w:left="355" w:right="3"/>
-      </w:pPr>
-      <w:r>
-        <w:t xml:space="preserve">Preece, D. A., Mehta, A., </w:t>
-      </w:r>
-      <w:r>
-        <w:rPr>
-          <w:rFonts w:cs="Aptos"/>
-          <w:b/>
-        </w:rPr>
-        <w:t>Petrova, K.</w:t>
-      </w:r>
-      <w:r>
-        <w:t xml:space="preserve">, Sikka, P., Bjureberg, J., Chen, W., ... &amp; Gross, J. J. (2023). The Perth Alexithymia Questionnaire-Short Form (PAQ-S): A 6-item measure of alexithymia. Journal of Affective Disorders. </w:t>
-      </w:r>
-    </w:p>
-    <w:p>
-      <w:pPr>
-        <w:ind w:left="360" w:right="3" w:firstLine="0"/>
-      </w:pPr>
-      <w:hyperlink r:id="rId18" w:history="1">
+    </w:p>
+    <w:p>
+      <w:pPr>
+        <w:spacing w:after="120"/>
+        <w:ind w:left="355"/>
+      </w:pPr>
+      <w:r>
+        <w:rPr>
+          <w:rFonts w:cs="Aptos"/>
+          <w:b/>
+        </w:rPr>
+        <w:t xml:space="preserve">Petrova, K.</w:t>
+      </w:r>
+      <w:r>
+        <w:rPr>
+          <w:rFonts w:cs="Aptos"/>
+        </w:rPr>
+        <w:t xml:space="preserve">, &amp; Schulz, M. S. (2022). Emotional Experiences in Technology-Mediated and In-Person Interactions: An Experience-Sampling Study. Cognition and Emotion, 36(4), 750–757. </w:t>
+      </w:r>
+      <w:hyperlink r:id="rId37" w:history="1">
         <w:r>
           <w:rPr>
             <w:rStyle w:val="Hyperlink"/>
+            <w:rFonts w:cs="Aptos"/>
           </w:rPr>
-          <w:t>https://doi.org/10.1016/j.jad.2023.01.036</w:t>
+          <w:t>https://doi.org/10.1080/02699931.2022.2043244</w:t>
         </w:r>
       </w:hyperlink>
-      <w:r>
-        <w:t xml:space="preserve">  </w:t>
-      </w:r>
-    </w:p>
-    <w:p>
-      <w:pPr>
-        <w:spacing w:after="31" w:line="259" w:lineRule="auto"/>
-        <w:ind w:left="0" w:firstLine="0"/>
-      </w:pPr>
-      <w:r>
-        <w:t xml:space="preserve"> </w:t>
-      </w:r>
-    </w:p>
-    <w:p>
-      <w:pPr>
-        <w:ind w:left="355" w:right="3"/>
-      </w:pPr>
-      <w:r>
-        <w:t xml:space="preserve">Preece, D. A., Mehta, A., </w:t>
-      </w:r>
-      <w:r>
-        <w:rPr>
-          <w:rFonts w:cs="Aptos"/>
-          <w:b/>
-        </w:rPr>
-        <w:t>Petrova, K.</w:t>
-      </w:r>
-      <w:r>
-        <w:t xml:space="preserve">, Sikka, P., Bjureberg, J., Becerra, R., &amp; Gross, J. J. (2023). Alexithymia and emotion regulation. Journal of Affective Disorders, 324, 232-238. </w:t>
-      </w:r>
-      <w:hyperlink r:id="rId19" w:history="1">
-        <w:r>
-          <w:rPr>
-            <w:rStyle w:val="Hyperlink"/>
-          </w:rPr>
-          <w:t>https://doi.org/10.1016/j.jad.2022.12.065</w:t>
-        </w:r>
-      </w:hyperlink>
-      <w:r>
-        <w:t xml:space="preserve"> </w:t>
-      </w:r>
-      <w:r>
-        <w:t xml:space="preserve"> </w:t>
-      </w:r>
-    </w:p>
-    <w:p>
-      <w:pPr>
-        <w:spacing w:after="31" w:line="259" w:lineRule="auto"/>
-        <w:ind w:left="0" w:firstLine="0"/>
-      </w:pPr>
-      <w:r>
-        <w:t xml:space="preserve"> </w:t>
-      </w:r>
-    </w:p>
-    <w:p>
-      <w:pPr>
-        <w:ind w:left="355" w:right="3"/>
-      </w:pPr>
-      <w:r>
-        <w:rPr>
-          <w:rFonts w:cs="Aptos"/>
-          <w:b/>
-        </w:rPr>
-        <w:t>Petrova, K.</w:t>
-      </w:r>
-      <w:r>
-        <w:t xml:space="preserve">, &amp; Schulz, M.S. (2022). Emotional experiences in technology-mediated and in-person interactions: An experience sampling study. Cognition and Emotion, 36(4). </w:t>
-      </w:r>
-      <w:hyperlink r:id="rId20" w:history="1">
-        <w:r>
-          <w:rPr>
-            <w:rStyle w:val="Hyperlink"/>
-          </w:rPr>
-          <w:t>https://doi.org/10.31234/osf.io/2teu5</w:t>
-        </w:r>
-      </w:hyperlink>
-      <w:r>
-        <w:t xml:space="preserve"> </w:t>
-      </w:r>
-      <w:r>
-        <w:t xml:space="preserve"> </w:t>
-      </w:r>
-    </w:p>
-    <w:p>
-      <w:pPr>
-        <w:spacing w:after="31" w:line="259" w:lineRule="auto"/>
-        <w:ind w:left="0" w:firstLine="0"/>
-      </w:pPr>
-      <w:r>
-        <w:t xml:space="preserve"> </w:t>
-      </w:r>
-    </w:p>
-    <w:p>
-      <w:pPr>
-        <w:ind w:left="355" w:right="3"/>
-      </w:pPr>
-      <w:r>
-        <w:rPr>
-          <w:rFonts w:cs="Aptos"/>
-          <w:b/>
-        </w:rPr>
-        <w:t>Petrova, K.</w:t>
-      </w:r>
-      <w:r>
-        <w:t xml:space="preserve">, Nevarez, M.D., Rice, J., Waldinger, R.J., Preacher, K.J., &amp; Schulz, M.S. (2021). Coherence between feelings and heart rate: Links to early adversity and responses to stress. Affective Science, 2(1), 1-13. </w:t>
-      </w:r>
-    </w:p>
-    <w:p>
-      <w:pPr>
-        <w:ind w:left="360" w:right="3" w:firstLine="0"/>
-      </w:pPr>
+    </w:p>
+    <w:p>
+      <w:pPr>
+        <w:spacing w:after="120"/>
+        <w:ind w:left="355"/>
+      </w:pPr>
+      <w:r>
+        <w:rPr>
+          <w:rFonts w:cs="Aptos"/>
+          <w:b/>
+        </w:rPr>
+        <w:t xml:space="preserve">Petrova, K.</w:t>
+      </w:r>
+      <w:r>
+        <w:rPr>
+          <w:rFonts w:cs="Aptos"/>
+        </w:rPr>
+        <w:t xml:space="preserve">, Nevarez, M. D., Rice, J., Waldinger, R. J., Preacher, K. J., &amp; Schulz, M. S. (2021). Coherence Between Feelings and Heart Rate: Links to Early Adversity and Responses to Stress. Affective Science, 2(1), 1–13. </w:t>
+      </w:r>
       <w:hyperlink r:id="rId21" w:history="1">
         <w:r>
           <w:rPr>
             <w:rStyle w:val="Hyperlink"/>
+            <w:rFonts w:cs="Aptos"/>
           </w:rPr>
           <w:t>https://doi.org/10.1007/s42761-020-00027-5</w:t>
         </w:r>
       </w:hyperlink>
-      <w:r>
-        <w:t xml:space="preserve">  </w:t>
-      </w:r>
-    </w:p>
-    <w:p>
-      <w:pPr>
-        <w:spacing w:after="31" w:line="259" w:lineRule="auto"/>
-        <w:ind w:left="0" w:firstLine="0"/>
-      </w:pPr>
-      <w:r>
-        <w:t xml:space="preserve"> </w:t>
-      </w:r>
-    </w:p>
-    <w:p>
-      <w:pPr>
-        <w:spacing w:after="95"/>
-        <w:ind w:left="355" w:right="3"/>
-      </w:pPr>
-      <w:r>
-        <w:rPr>
-          <w:rFonts w:cs="Aptos"/>
-          <w:b/>
-        </w:rPr>
-        <w:t>Petrova, K.</w:t>
-      </w:r>
-      <w:r>
-        <w:t>, Nevarez, M.D., Waldinger, R.J., Preacher, K.J., &amp; Schulz, M.S. (2021). Self-distancing and avoidance mediate the links between trait mindfulness and responses to emotional challenges. Mindfulness, 12(4), 947</w:t>
-      </w:r>
-      <w:r>
-        <w:rPr>
-          <w:rFonts w:cs="Aptos"/>
-        </w:rPr>
-        <w:t xml:space="preserve">– </w:t>
-      </w:r>
-      <w:r>
-        <w:t xml:space="preserve">958. </w:t>
+    </w:p>
+    <w:p>
+      <w:pPr>
+        <w:spacing w:after="120"/>
+        <w:ind w:left="355"/>
+      </w:pPr>
+      <w:r>
+        <w:rPr>
+          <w:rFonts w:cs="Aptos"/>
+          <w:b/>
+        </w:rPr>
+        <w:t xml:space="preserve">Petrova, K.</w:t>
+      </w:r>
+      <w:r>
+        <w:rPr>
+          <w:rFonts w:cs="Aptos"/>
+        </w:rPr>
+        <w:t xml:space="preserve">, Nevarez, M. D., Waldinger, R. J., Preacher, K. J., &amp; Schulz, M. S. (2021). Self-Distancing and Avoidance Mediate the Links Between Trait Mindfulness and Responses to Emotional Challenges. Mindfulness, 12(4), 947–958. </w:t>
       </w:r>
       <w:hyperlink r:id="rId22" w:history="1">
         <w:r>
           <w:rPr>
             <w:rStyle w:val="Hyperlink"/>
+            <w:rFonts w:cs="Aptos"/>
           </w:rPr>
           <w:t>https://doi.org/10.1007/s12671-020-01559-4</w:t>
         </w:r>
       </w:hyperlink>
-      <w:r>
-        <w:t xml:space="preserve"> </w:t>
-      </w:r>
-      <w:r>
-        <w:t xml:space="preserve"> </w:t>
-      </w:r>
     </w:p>
     <w:p>
       <w:pPr>
@@ -1893,7 +1559,7 @@
         </w:rPr>
       </w:pPr>
       <w:r>
-        <w:t>MANUSCRIPTS UNDER REVIEW AND IN PREPARATION</w:t>
+        <w:t>MANUSCRIPTS IN PREPARATION</w:t>
       </w:r>
       <w:r>
         <w:rPr>
@@ -1906,6 +1572,7 @@
     </w:p>
     <w:p>
       <w:pPr>
+        <w:spacing w:after="120"/>
         <w:ind w:left="355"/>
       </w:pPr>
       <w:r>
@@ -1913,30 +1580,18 @@
           <w:rFonts w:cs="Aptos"/>
           <w:b/>
         </w:rPr>
-        <w:t>Petrova, K.</w:t>
-      </w:r>
-      <w:r>
-        <w:rPr>
-          <w:rFonts w:cs="Aptos"/>
-        </w:rPr>
-        <w:t xml:space="preserve">, †Costa, A., †Mallen, S., &amp; Gross, J.J. (in preparation). Everyday Regrets: An Ecological Momentary </w:t>
-      </w:r>
-      <w:r>
-        <w:t xml:space="preserve">Assessment Study. </w:t>
-      </w:r>
-    </w:p>
-    <w:p>
-      <w:pPr>
-        <w:spacing w:after="31" w:line="259" w:lineRule="auto"/>
-        <w:ind w:left="0" w:firstLine="0"/>
-      </w:pPr>
-      <w:r>
-        <w:t xml:space="preserve"> </w:t>
-      </w:r>
-    </w:p>
-    <w:p>
-      <w:pPr>
-        <w:spacing w:after="94"/>
+        <w:t xml:space="preserve">Petrova, K.</w:t>
+      </w:r>
+      <w:r>
+        <w:rPr>
+          <w:rFonts w:cs="Aptos"/>
+        </w:rPr>
+        <w:t xml:space="preserve"> (in preparation). Computational Affective Science.</w:t>
+      </w:r>
+    </w:p>
+    <w:p>
+      <w:pPr>
+        <w:spacing w:after="120"/>
         <w:ind w:left="355"/>
       </w:pPr>
       <w:r>
@@ -1944,16 +1599,32 @@
           <w:rFonts w:cs="Aptos"/>
           <w:b/>
         </w:rPr>
-        <w:t>Petrova, K.</w:t>
-      </w:r>
-      <w:r>
-        <w:rPr>
-          <w:rFonts w:cs="Aptos"/>
-        </w:rPr>
-        <w:t xml:space="preserve">, †Dang, A., Geng., G., Yaz, B., Gross, J.J., &amp; Gerstenberg, T. (in preparation). Learning From What Might </w:t>
-      </w:r>
-      <w:r>
-        <w:t xml:space="preserve">Have Been: Behavioral, Computational, and Attentional Signatures of Regret. </w:t>
+        <w:t xml:space="preserve">Petrova, K.</w:t>
+      </w:r>
+      <w:r>
+        <w:rPr>
+          <w:rFonts w:cs="Aptos"/>
+        </w:rPr>
+        <w:t xml:space="preserve">, †Costa, A., †Dang, A., †Mallen, S., Yanowitch, N., Gerstenberg, T., &amp; Gross, J. J. (in preparation). Counterfactual Construction in Regret.</w:t>
+      </w:r>
+    </w:p>
+    <w:p>
+      <w:pPr>
+        <w:spacing w:after="120"/>
+        <w:ind w:left="355"/>
+      </w:pPr>
+      <w:r>
+        <w:rPr>
+          <w:rFonts w:cs="Aptos"/>
+          <w:b/>
+        </w:rPr>
+        <w:t xml:space="preserve">Petrova, K.</w:t>
+      </w:r>
+      <w:r>
+        <w:rPr>
+          <w:rFonts w:cs="Aptos"/>
+        </w:rPr>
+        <w:t xml:space="preserve">, Saad, M., †Dang, A., Geng, G., Yaz, B., Gross, J. J., &amp; Gerstenberg, T. (in preparation). Learning From Regret.</w:t>
       </w:r>
     </w:p>
     <w:p>
@@ -1993,26 +1664,31 @@
     </w:p>
     <w:p>
       <w:pPr>
-        <w:ind w:left="-15" w:right="3" w:firstLine="0"/>
-      </w:pPr>
-      <w:r>
-        <w:rPr>
-          <w:rFonts w:cs="Aptos"/>
-          <w:b/>
-        </w:rPr>
-        <w:t>Petrova, K.</w:t>
-      </w:r>
-      <w:r>
-        <w:t xml:space="preserve"> &amp; Gross, J.J. (2023). Emotion regulation in self and other. In I. Roskam, J.J. Gross, &amp; M. Mikolajczak (Ed.), </w:t>
-      </w:r>
-    </w:p>
-    <w:p>
-      <w:pPr>
-        <w:ind w:left="360" w:right="3" w:firstLine="0"/>
-      </w:pPr>
-      <w:r>
-        <w:t xml:space="preserve">Emotion Regulation and Parenting. https://doi.org/10.31234/osf.io/ckhbw </w:t>
-      </w:r>
+        <w:spacing w:after="120"/>
+        <w:ind w:left="355"/>
+      </w:pPr>
+      <w:r>
+        <w:rPr>
+          <w:rFonts w:cs="Aptos"/>
+          <w:b/>
+        </w:rPr>
+        <w:t xml:space="preserve">Petrova, K.</w:t>
+      </w:r>
+      <w:r>
+        <w:rPr>
+          <w:rFonts w:cs="Aptos"/>
+        </w:rPr>
+        <w:t xml:space="preserve">, &amp; Gross, J. J. (2023). Emotion Regulation in Self and Others. In I. Roskam, J. J. Gross, &amp; M. Mikolajczak (Eds.), Emotion Regulation and Parenting (pp. 35–54). Cambridge University Press. </w:t>
+      </w:r>
+      <w:hyperlink r:id="rId38" w:history="1">
+        <w:r>
+          <w:rPr>
+            <w:rStyle w:val="Hyperlink"/>
+            <w:rFonts w:cs="Aptos"/>
+          </w:rPr>
+          <w:t>https://doi.org/10.1017/9781009304368.004</w:t>
+        </w:r>
+      </w:hyperlink>
     </w:p>
     <w:p>
       <w:pPr>
@@ -2203,17 +1879,20 @@
     <w:p>
       <w:pPr>
         <w:spacing w:after="94"/>
-        <w:ind w:left="355" w:right="3"/>
-      </w:pPr>
-      <w:r>
-        <w:rPr>
-          <w:rFonts w:cs="Aptos"/>
-          <w:b/>
-        </w:rPr>
-        <w:t>Petrova, K.</w:t>
-      </w:r>
-      <w:r>
-        <w:t xml:space="preserve"> (March 2025). Computational Affective Science. Symposium chaired and organized for the 2025 Annual Convention for the Society of Affective Science, Portland, OR. </w:t>
+        <w:ind w:left="355"/>
+      </w:pPr>
+      <w:r>
+        <w:rPr>
+          <w:rFonts w:cs="Aptos"/>
+          <w:b/>
+        </w:rPr>
+        <w:t xml:space="preserve">Petrova, K.</w:t>
+      </w:r>
+      <w:r>
+        <w:rPr>
+          <w:rFonts w:cs="Aptos"/>
+        </w:rPr>
+        <w:t xml:space="preserve"> (March 2025). Computational Affective Science. Symposium chaired and organized at the Annual Conference of the Society for Affective Science, Portland, OR.</w:t>
       </w:r>
     </w:p>
     <w:p>
@@ -2244,123 +1923,89 @@
     </w:p>
     <w:p>
       <w:pPr>
-        <w:ind w:left="-15" w:firstLine="0"/>
-      </w:pPr>
-      <w:r>
-        <w:rPr>
-          <w:rFonts w:cs="Aptos"/>
-          <w:b/>
-        </w:rPr>
-        <w:t>Petrova, K.</w:t>
-      </w:r>
-      <w:r>
-        <w:rPr>
-          <w:rFonts w:cs="Aptos"/>
-        </w:rPr>
-        <w:t xml:space="preserve">, †Dang, A., Geng., G., Yaz, B., Gross, J.J., &amp; Gerstenberg, T. (June 2026). Regret at First Sight: </w:t>
-      </w:r>
-    </w:p>
-    <w:p>
-      <w:pPr>
-        <w:ind w:left="360" w:right="3" w:firstLine="0"/>
-      </w:pPr>
-      <w:r>
-        <w:t xml:space="preserve">Counterfactual Attention Predicts Regret In An Eye-Tracking Study. </w:t>
-      </w:r>
-      <w:r>
-        <w:t xml:space="preserve">Annual meeting of the Bay Area Affective Science Society, </w:t>
-      </w:r>
-      <w:r>
-        <w:t>San Francisco</w:t>
-      </w:r>
-      <w:r>
-        <w:t xml:space="preserve">, CA. </w:t>
-      </w:r>
-    </w:p>
-    <w:p>
-      <w:pPr>
-        <w:rPr>
-          <w:lang w:eastAsia="en-US"/>
-        </w:rPr>
-      </w:pPr>
-    </w:p>
-    <w:p>
-      <w:pPr>
-        <w:ind w:left="355" w:right="3"/>
-      </w:pPr>
-      <w:r>
-        <w:rPr>
-          <w:rFonts w:cs="Aptos"/>
-          <w:b/>
-        </w:rPr>
-        <w:t>Petrova, K.</w:t>
-      </w:r>
-      <w:r>
-        <w:t xml:space="preserve">, Gross, J.J., &amp; Gerstenberg, T. (June 2025). Affective Science in Silico: A Case Study of Regret. Annual meeting of the Bay Area Affective Science Society, Stanford, CA. </w:t>
-      </w:r>
-    </w:p>
-    <w:p>
-      <w:pPr>
-        <w:spacing w:after="31" w:line="259" w:lineRule="auto"/>
-        <w:ind w:left="0" w:firstLine="0"/>
-      </w:pPr>
-      <w:r>
-        <w:t xml:space="preserve"> </w:t>
-      </w:r>
-    </w:p>
-    <w:p>
-      <w:pPr>
-        <w:ind w:left="355" w:right="3"/>
-      </w:pPr>
-      <w:r>
-        <w:rPr>
-          <w:rFonts w:cs="Aptos"/>
-          <w:b/>
-        </w:rPr>
-        <w:t>Petrova, K.</w:t>
-      </w:r>
-      <w:r>
-        <w:t xml:space="preserve">, Gross, J.J., &amp; Gerstenberg, T. (March 2025). Mind the information gap: When regret helps or hurts learning. Annual Convention for the Society of Affective Science, Portland, OR. </w:t>
-      </w:r>
-    </w:p>
-    <w:p>
-      <w:pPr>
-        <w:spacing w:after="26" w:line="259" w:lineRule="auto"/>
-        <w:ind w:left="0" w:firstLine="0"/>
-      </w:pPr>
-      <w:r>
-        <w:t xml:space="preserve"> </w:t>
-      </w:r>
-    </w:p>
-    <w:p>
-      <w:pPr>
-        <w:ind w:left="355" w:right="3"/>
-      </w:pPr>
-      <w:r>
-        <w:rPr>
-          <w:rFonts w:cs="Aptos"/>
-          <w:b/>
-        </w:rPr>
-        <w:t>Petrova, K.</w:t>
-      </w:r>
-      <w:r>
-        <w:t xml:space="preserve">, Gross, J.J., &amp; Gerstenberg, T. (June 2024). Learning from regret: A computational affective science approach. Annual meeting of the Bay Area Affective Science Society, Berkeley, CA. </w:t>
-      </w:r>
-    </w:p>
-    <w:p>
-      <w:pPr>
-        <w:spacing w:after="32" w:line="259" w:lineRule="auto"/>
-        <w:ind w:left="0" w:firstLine="0"/>
-      </w:pPr>
-      <w:r>
-        <w:t xml:space="preserve"> </w:t>
-      </w:r>
-    </w:p>
-    <w:p>
-      <w:pPr>
-        <w:ind w:left="355" w:right="3"/>
-      </w:pPr>
-      <w:r>
+        <w:spacing w:after="120"/>
+        <w:ind w:left="355"/>
+      </w:pPr>
+      <w:r>
+        <w:rPr>
+          <w:rFonts w:cs="Aptos"/>
+          <w:b/>
+        </w:rPr>
+        <w:t xml:space="preserve">Petrova, K.</w:t>
+      </w:r>
+      <w:r>
+        <w:rPr>
+          <w:rFonts w:cs="Aptos"/>
+        </w:rPr>
+        <w:t xml:space="preserve">, †Dang, A., Geng, G., Yaz, B., Gross, J. J., &amp; Gerstenberg, T. (June 2026). Regret at First Sight: Counterfactual Attention Predicts Regret in an Eye-Tracking Study. Annual Meeting of the Bay Area Affective Science Society, San Francisco, CA.</w:t>
+      </w:r>
+    </w:p>
+    <w:p>
+      <w:pPr>
+        <w:spacing w:after="120"/>
+        <w:ind w:left="355"/>
+      </w:pPr>
+      <w:r>
+        <w:rPr>
+          <w:rFonts w:cs="Aptos"/>
+          <w:b/>
+        </w:rPr>
+        <w:t xml:space="preserve">Petrova, K.</w:t>
+      </w:r>
+      <w:r>
+        <w:rPr>
+          <w:rFonts w:cs="Aptos"/>
+        </w:rPr>
+        <w:t xml:space="preserve">, Gross, J. J., &amp; Gerstenberg, T. (June 2025). Affective Science in Silico: A Case Study of Regret. Annual Meeting of the Bay Area Affective Science Society, Stanford, CA.</w:t>
+      </w:r>
+    </w:p>
+    <w:p>
+      <w:pPr>
+        <w:spacing w:after="120"/>
+        <w:ind w:left="355"/>
+      </w:pPr>
+      <w:r>
+        <w:rPr>
+          <w:rFonts w:cs="Aptos"/>
+          <w:b/>
+        </w:rPr>
+        <w:t xml:space="preserve">Petrova, K.</w:t>
+      </w:r>
+      <w:r>
+        <w:rPr>
+          <w:rFonts w:cs="Aptos"/>
+        </w:rPr>
+        <w:t xml:space="preserve">, Gross, J. J., &amp; Gerstenberg, T. (March 2025). Mind the Information Gap: When Regret Helps or Hurts Learning. Annual Conference of the Society for Affective Science, Portland, OR.</w:t>
+      </w:r>
+    </w:p>
+    <w:p>
+      <w:pPr>
+        <w:spacing w:after="120"/>
+        <w:ind w:left="355"/>
+      </w:pPr>
+      <w:r>
+        <w:rPr>
+          <w:rFonts w:cs="Aptos"/>
+          <w:b/>
+        </w:rPr>
+        <w:t xml:space="preserve">Petrova, K.</w:t>
+      </w:r>
+      <w:r>
+        <w:rPr>
+          <w:rFonts w:cs="Aptos"/>
+        </w:rPr>
+        <w:t xml:space="preserve">, Gross, J. J., &amp; Gerstenberg, T. (June 2024). Learning From Regret: A Computational Affective Science Approach. Annual Meeting of the Bay Area Affective Science Society, Berkeley, CA.</w:t>
+      </w:r>
+    </w:p>
+    <w:p>
+      <w:pPr>
+        <w:spacing w:after="120"/>
+        <w:ind w:left="355"/>
+      </w:pPr>
+      <w:r>
+        <w:rPr>
+          <w:rFonts w:cs="Aptos"/>
+        </w:rPr>
         <w:t xml:space="preserve">Werner, K. M., </w:t>
       </w:r>
       <w:r>
@@ -2368,157 +2013,120 @@
           <w:rFonts w:cs="Aptos"/>
           <w:b/>
         </w:rPr>
-        <w:t>Petrova, K.</w:t>
-      </w:r>
-      <w:r>
-        <w:t xml:space="preserve">, &amp; Gross, J. J. (March 2024). Emotion regulation flexibility: A process model framework. Annual Convention for the Society of Affective Science, New Orleans, LA. </w:t>
-      </w:r>
-    </w:p>
-    <w:p>
-      <w:pPr>
-        <w:spacing w:after="26" w:line="259" w:lineRule="auto"/>
-        <w:ind w:left="0" w:firstLine="0"/>
-      </w:pPr>
-      <w:r>
-        <w:t xml:space="preserve"> </w:t>
-      </w:r>
-    </w:p>
-    <w:p>
-      <w:pPr>
-        <w:ind w:left="355" w:right="3"/>
-      </w:pPr>
-      <w:r>
-        <w:rPr>
-          <w:rFonts w:cs="Aptos"/>
-        </w:rPr>
-        <w:t>†</w:t>
-      </w:r>
-      <w:proofErr w:type="spellStart"/>
-      <w:r>
-        <w:rPr>
-          <w:rFonts w:cs="Aptos"/>
-        </w:rPr>
-        <w:t>Shainy</w:t>
-      </w:r>
-      <w:proofErr w:type="spellEnd"/>
-      <w:r>
-        <w:rPr>
-          <w:rFonts w:cs="Aptos"/>
-        </w:rPr>
-        <w:t xml:space="preserve">, M.R., </w:t>
-      </w:r>
-      <w:r>
-        <w:rPr>
-          <w:rFonts w:cs="Aptos"/>
-          <w:b/>
-        </w:rPr>
-        <w:t>Petrova, K.</w:t>
-      </w:r>
-      <w:r>
-        <w:t xml:space="preserve">, Gross, J.J. (February 2024). From trait to state emotion beliefs. Virtual flash-talk presented at the Annual Convention of the Society for Personality and Social Psychology. </w:t>
-      </w:r>
-    </w:p>
-    <w:p>
-      <w:pPr>
-        <w:spacing w:after="31" w:line="259" w:lineRule="auto"/>
-        <w:ind w:left="0" w:firstLine="0"/>
-      </w:pPr>
-      <w:r>
-        <w:t xml:space="preserve"> </w:t>
-      </w:r>
-    </w:p>
-    <w:p>
-      <w:pPr>
-        <w:ind w:left="355" w:right="3"/>
-      </w:pPr>
-      <w:r>
-        <w:rPr>
-          <w:rFonts w:cs="Aptos"/>
-          <w:b/>
-        </w:rPr>
-        <w:t>Petrova, K.</w:t>
-      </w:r>
-      <w:r>
-        <w:t xml:space="preserve"> &amp; Gross, J.J. (March-April 2023). Occurrent beliefs about emotions predict emotion regulation in everyday life. Flash-talk presented at the Annual Conference of the Society for Affective Science, Long Beach, CA. </w:t>
-      </w:r>
-    </w:p>
-    <w:p>
-      <w:pPr>
-        <w:spacing w:after="26" w:line="259" w:lineRule="auto"/>
-        <w:ind w:left="0" w:firstLine="0"/>
-      </w:pPr>
-      <w:r>
-        <w:t xml:space="preserve"> </w:t>
-      </w:r>
-    </w:p>
-    <w:p>
-      <w:pPr>
-        <w:ind w:left="355" w:right="3"/>
-      </w:pPr>
-      <w:r>
-        <w:rPr>
-          <w:rFonts w:cs="Aptos"/>
-        </w:rPr>
-        <w:t xml:space="preserve">†Zielke, J.N., </w:t>
-      </w:r>
-      <w:r>
-        <w:rPr>
-          <w:rFonts w:cs="Aptos"/>
-          <w:b/>
-        </w:rPr>
-        <w:t>Petrova, K.</w:t>
-      </w:r>
-      <w:r>
-        <w:t xml:space="preserve">, &amp; Gross, J.J. (March-April 2023). Examining the roles of emotion beliefs and interpersonal emotion regulation in loneliness. Flash-talk presented at the Annual Conference of the Society for Affective Science, Long Beach, CA. </w:t>
-      </w:r>
-    </w:p>
-    <w:p>
-      <w:pPr>
-        <w:spacing w:after="31" w:line="259" w:lineRule="auto"/>
-        <w:ind w:left="0" w:firstLine="0"/>
-      </w:pPr>
-      <w:r>
-        <w:t xml:space="preserve"> </w:t>
-      </w:r>
-    </w:p>
-    <w:p>
-      <w:pPr>
-        <w:ind w:left="355" w:right="3"/>
-      </w:pPr>
-      <w:r>
-        <w:rPr>
-          <w:rFonts w:cs="Aptos"/>
-          <w:b/>
-        </w:rPr>
-        <w:t>Petrova, K.</w:t>
-      </w:r>
-      <w:r>
-        <w:t xml:space="preserve">, Nevarez, M.D., Rice, J., Waldinger, R.J., Preacher, K.J., &amp; Schulz, M.S. (March-April 2022). Coherence between feelings and heart rate: Links to early adversity and responses to stress. Virtual talk presented at the Symposium on Emotion Coherence at the Annual Conference of the Society for Affective Science. </w:t>
-      </w:r>
-    </w:p>
-    <w:p>
-      <w:pPr>
-        <w:spacing w:after="32" w:line="259" w:lineRule="auto"/>
-        <w:ind w:left="0" w:firstLine="0"/>
-      </w:pPr>
-      <w:r>
-        <w:t xml:space="preserve"> </w:t>
-      </w:r>
-    </w:p>
-    <w:p>
-      <w:pPr>
-        <w:spacing w:after="94"/>
-        <w:ind w:left="355" w:right="3"/>
-      </w:pPr>
-      <w:r>
-        <w:rPr>
-          <w:rFonts w:cs="Aptos"/>
-          <w:b/>
-        </w:rPr>
-        <w:t>Petrova, K.</w:t>
-      </w:r>
-      <w:r>
-        <w:t xml:space="preserve"> &amp; Schulz, M.S. (April 2021). Emotion recognition in digitally mediated communication. Virtual flash-talk presented at the Annual Conference of the Society for Affective Science. </w:t>
+        <w:t xml:space="preserve">Petrova, K.</w:t>
+      </w:r>
+      <w:r>
+        <w:rPr>
+          <w:rFonts w:cs="Aptos"/>
+        </w:rPr>
+        <w:t xml:space="preserve">, &amp; Gross, J. J. (March 2024). Emotion Regulation Flexibility: A Process Model Framework. Annual Conference of the Society for Affective Science, New Orleans, LA.</w:t>
+      </w:r>
+    </w:p>
+    <w:p>
+      <w:pPr>
+        <w:spacing w:after="120"/>
+        <w:ind w:left="355"/>
+      </w:pPr>
+      <w:r>
+        <w:rPr>
+          <w:rFonts w:cs="Aptos"/>
+        </w:rPr>
+        <w:t xml:space="preserve">†Shainy, M. R., </w:t>
+      </w:r>
+      <w:r>
+        <w:rPr>
+          <w:rFonts w:cs="Aptos"/>
+          <w:b/>
+        </w:rPr>
+        <w:t xml:space="preserve">Petrova, K.</w:t>
+      </w:r>
+      <w:r>
+        <w:rPr>
+          <w:rFonts w:cs="Aptos"/>
+        </w:rPr>
+        <w:t xml:space="preserve">, &amp; Gross, J. J. (February 2024). From Trait to State Emotion Beliefs. Virtual flash talk presented at the Annual Convention of the Society for Personality and Social Psychology.</w:t>
+      </w:r>
+    </w:p>
+    <w:p>
+      <w:pPr>
+        <w:spacing w:after="120"/>
+        <w:ind w:left="355"/>
+      </w:pPr>
+      <w:r>
+        <w:rPr>
+          <w:rFonts w:cs="Aptos"/>
+          <w:b/>
+        </w:rPr>
+        <w:t xml:space="preserve">Petrova, K.</w:t>
+      </w:r>
+      <w:r>
+        <w:rPr>
+          <w:rFonts w:cs="Aptos"/>
+        </w:rPr>
+        <w:t xml:space="preserve">, &amp; Gross, J. J. (March–April 2023). Occurrent Beliefs About Emotions Predict Emotion Regulation in Everyday Life. Flash talk presented at the Annual Conference of the Society for Affective Science, Long Beach, CA.</w:t>
+      </w:r>
+    </w:p>
+    <w:p>
+      <w:pPr>
+        <w:spacing w:after="120"/>
+        <w:ind w:left="355"/>
+      </w:pPr>
+      <w:r>
+        <w:rPr>
+          <w:rFonts w:cs="Aptos"/>
+        </w:rPr>
+        <w:t xml:space="preserve">†Zielke, J. N., </w:t>
+      </w:r>
+      <w:r>
+        <w:rPr>
+          <w:rFonts w:cs="Aptos"/>
+          <w:b/>
+        </w:rPr>
+        <w:t xml:space="preserve">Petrova, K.</w:t>
+      </w:r>
+      <w:r>
+        <w:rPr>
+          <w:rFonts w:cs="Aptos"/>
+        </w:rPr>
+        <w:t xml:space="preserve">, &amp; Gross, J. J. (March–April 2023). Examining the Roles of Emotion Beliefs and Interpersonal Emotion Regulation in Loneliness. Flash talk presented at the Annual Conference of the Society for Affective Science, Long Beach, CA.</w:t>
+      </w:r>
+    </w:p>
+    <w:p>
+      <w:pPr>
+        <w:spacing w:after="120"/>
+        <w:ind w:left="355"/>
+      </w:pPr>
+      <w:r>
+        <w:rPr>
+          <w:rFonts w:cs="Aptos"/>
+          <w:b/>
+        </w:rPr>
+        <w:t xml:space="preserve">Petrova, K.</w:t>
+      </w:r>
+      <w:r>
+        <w:rPr>
+          <w:rFonts w:cs="Aptos"/>
+        </w:rPr>
+        <w:t xml:space="preserve">, Nevarez, M. D., Rice, J., Waldinger, R. J., Preacher, K. J., &amp; Schulz, M. S. (March–April 2022). Coherence Between Feelings and Heart Rate: Links to Early Adversity and Responses to Stress. Virtual talk presented at the Symposium on Emotion Coherence, Annual Conference of the Society for Affective Science.</w:t>
+      </w:r>
+    </w:p>
+    <w:p>
+      <w:pPr>
+        <w:spacing w:after="120"/>
+        <w:ind w:left="355"/>
+      </w:pPr>
+      <w:r>
+        <w:rPr>
+          <w:rFonts w:cs="Aptos"/>
+          <w:b/>
+        </w:rPr>
+        <w:t xml:space="preserve">Petrova, K.</w:t>
+      </w:r>
+      <w:r>
+        <w:rPr>
+          <w:rFonts w:cs="Aptos"/>
+        </w:rPr>
+        <w:t xml:space="preserve">, &amp; Schulz, M. S. (April 2021). Emotion Recognition in Digitally Mediated Communication. Virtual flash talk presented at the Annual Conference of the Society for Affective Science.</w:t>
       </w:r>
     </w:p>
     <w:p>
@@ -2556,42 +2164,8 @@
     </w:p>
     <w:p>
       <w:pPr>
-        <w:ind w:left="-15" w:firstLine="0"/>
-      </w:pPr>
-      <w:r>
-        <w:rPr>
-          <w:rFonts w:cs="Aptos"/>
-          <w:b/>
-        </w:rPr>
-        <w:t>Petrova, K.</w:t>
-      </w:r>
-      <w:r>
-        <w:rPr>
-          <w:rFonts w:cs="Aptos"/>
-        </w:rPr>
-        <w:t xml:space="preserve">, †Dang, A., Geng., G., Yaz, B., Gross, J.J., &amp; Gerstenberg, T. (March 2026). Regret at First Sight: </w:t>
-      </w:r>
-    </w:p>
-    <w:p>
-      <w:pPr>
-        <w:ind w:left="360" w:right="3" w:firstLine="0"/>
-      </w:pPr>
-      <w:r>
-        <w:t xml:space="preserve">Counterfactual Attention Predicts Regret In An Eye-Tracking Study. Annual Conference of the Society for Affective Science. Pittsburgh, PA. </w:t>
-      </w:r>
-    </w:p>
-    <w:p>
-      <w:pPr>
-        <w:spacing w:after="31" w:line="259" w:lineRule="auto"/>
-        <w:ind w:left="0" w:firstLine="0"/>
-      </w:pPr>
-      <w:r>
-        <w:t xml:space="preserve"> </w:t>
-      </w:r>
-    </w:p>
-    <w:p>
-      <w:pPr>
-        <w:ind w:left="355" w:right="3"/>
+        <w:spacing w:after="120"/>
+        <w:ind w:left="355"/>
       </w:pPr>
       <w:r>
         <w:rPr>
@@ -2604,24 +2178,19 @@
           <w:rFonts w:cs="Aptos"/>
           <w:b/>
         </w:rPr>
-        <w:t>Petrova, K.</w:t>
-      </w:r>
-      <w:r>
-        <w:t xml:space="preserve">, &amp; Gross, J.J. (March 2026). The Stories We Tell Ourselves: Narrative Closure And The Regulation Of Regret. Annual Conference of the Society for Affective Science. Pittsburgh, PA. </w:t>
-      </w:r>
-    </w:p>
-    <w:p>
-      <w:pPr>
-        <w:spacing w:after="32" w:line="259" w:lineRule="auto"/>
-        <w:ind w:left="0" w:firstLine="0"/>
-      </w:pPr>
-      <w:r>
-        <w:t xml:space="preserve"> </w:t>
-      </w:r>
-    </w:p>
-    <w:p>
-      <w:pPr>
-        <w:ind w:left="355" w:right="3"/>
+        <w:t xml:space="preserve">Petrova, K.</w:t>
+      </w:r>
+      <w:r>
+        <w:rPr>
+          <w:rFonts w:cs="Aptos"/>
+        </w:rPr>
+        <w:t xml:space="preserve">, &amp; Gross, J. J. (March 2026). The Stories We Tell Ourselves: Narrative Closure and the Regulation of Regret. Annual Conference of the Society for Affective Science, Pittsburgh, PA.</w:t>
+      </w:r>
+    </w:p>
+    <w:p>
+      <w:pPr>
+        <w:spacing w:after="120"/>
+        <w:ind w:left="355"/>
       </w:pPr>
       <w:r>
         <w:rPr>
@@ -2634,54 +2203,38 @@
           <w:rFonts w:cs="Aptos"/>
           <w:b/>
         </w:rPr>
-        <w:t>Petrova, K.</w:t>
-      </w:r>
-      <w:r>
-        <w:rPr>
-          <w:rFonts w:cs="Aptos"/>
-        </w:rPr>
-        <w:t xml:space="preserve">, &amp; Gross, J.J. (March 2026). What’s done or left undone: the behavioral consequences of </w:t>
-      </w:r>
-      <w:r>
-        <w:t xml:space="preserve">counterfactual framing in regret. Annual Conference of the Society for Affective Science. Pittsburgh, PA. </w:t>
-      </w:r>
-    </w:p>
-    <w:p>
-      <w:pPr>
-        <w:spacing w:after="31" w:line="259" w:lineRule="auto"/>
-        <w:ind w:left="0" w:firstLine="0"/>
-      </w:pPr>
-      <w:r>
-        <w:t xml:space="preserve"> </w:t>
-      </w:r>
-    </w:p>
-    <w:p>
-      <w:pPr>
-        <w:ind w:left="355" w:right="3"/>
-      </w:pPr>
-      <w:r>
-        <w:rPr>
-          <w:rFonts w:cs="Aptos"/>
-          <w:b/>
-        </w:rPr>
-        <w:t>Petrova, K.</w:t>
-      </w:r>
-      <w:r>
-        <w:t xml:space="preserve"> &amp; Gross, J.J. (March 2024). Reappraisal as reasoning: A computational affective science approach. Annual Conference of the Society for Affective Science. New Orleans, LA. </w:t>
-      </w:r>
-    </w:p>
-    <w:p>
-      <w:pPr>
-        <w:spacing w:after="32" w:line="259" w:lineRule="auto"/>
-        <w:ind w:left="0" w:firstLine="0"/>
-      </w:pPr>
-      <w:r>
-        <w:t xml:space="preserve"> </w:t>
-      </w:r>
-    </w:p>
-    <w:p>
-      <w:pPr>
-        <w:ind w:left="355" w:right="3"/>
+        <w:t xml:space="preserve">Petrova, K.</w:t>
+      </w:r>
+      <w:r>
+        <w:rPr>
+          <w:rFonts w:cs="Aptos"/>
+        </w:rPr>
+        <w:t xml:space="preserve">, &amp; Gross, J. J. (March 2026). What’s Done or Left Undone: The Behavioral Consequences of Counterfactual Framing in Regret. Annual Conference of the Society for Affective Science, Pittsburgh, PA.</w:t>
+      </w:r>
+    </w:p>
+    <w:p>
+      <w:pPr>
+        <w:spacing w:after="120"/>
+        <w:ind w:left="355"/>
+      </w:pPr>
+      <w:r>
+        <w:rPr>
+          <w:rFonts w:cs="Aptos"/>
+          <w:b/>
+        </w:rPr>
+        <w:t xml:space="preserve">Petrova, K.</w:t>
+      </w:r>
+      <w:r>
+        <w:rPr>
+          <w:rFonts w:cs="Aptos"/>
+        </w:rPr>
+        <w:t xml:space="preserve">, †Dang, A., Geng, G., Yaz, B., Gross, J. J., &amp; Gerstenberg, T. (March 2026). Regret at First Sight: Counterfactual Attention Predicts Regret in an Eye-Tracking Study. Annual Conference of the Society for Affective Science, Pittsburgh, PA.</w:t>
+      </w:r>
+    </w:p>
+    <w:p>
+      <w:pPr>
+        <w:spacing w:after="120"/>
+        <w:ind w:left="355"/>
       </w:pPr>
       <w:r>
         <w:rPr>
@@ -2694,67 +2247,43 @@
           <w:rFonts w:cs="Aptos"/>
           <w:b/>
         </w:rPr>
-        <w:t>Petrova, K.</w:t>
-      </w:r>
-      <w:r>
-        <w:t xml:space="preserve">, &amp; Gross, J.J. (March 2024). Situational Contributors to State Alexithymia: A </w:t>
-      </w:r>
-      <w:proofErr w:type="spellStart"/>
-      <w:r>
-        <w:t>MixedMethods</w:t>
-      </w:r>
-      <w:proofErr w:type="spellEnd"/>
-      <w:r>
-        <w:t xml:space="preserve"> Approach. Annual Conference of the Society for Affective Science, Emotion Regulation Preconference, New Orleans, LA. </w:t>
-      </w:r>
-    </w:p>
-    <w:p>
-      <w:pPr>
-        <w:spacing w:after="26" w:line="259" w:lineRule="auto"/>
-        <w:ind w:left="0" w:firstLine="0"/>
-      </w:pPr>
-      <w:r>
-        <w:t xml:space="preserve"> </w:t>
-      </w:r>
-    </w:p>
-    <w:p>
-      <w:pPr>
-        <w:ind w:left="355" w:right="3"/>
-      </w:pPr>
-      <w:r>
-        <w:rPr>
-          <w:rFonts w:cs="Aptos"/>
-        </w:rPr>
-        <w:lastRenderedPageBreak/>
-        <w:t xml:space="preserve">†Zielke, J., </w:t>
-      </w:r>
-      <w:r>
-        <w:rPr>
-          <w:rFonts w:cs="Aptos"/>
-          <w:b/>
-        </w:rPr>
-        <w:t>Petrova, K.</w:t>
-      </w:r>
-      <w:r>
-        <w:t xml:space="preserve">, Mehta, A., &amp; Gross, J. J. (March 2024). Examining the causal role of reappraisal on emotion beliefs and affective wellbeing. Annual Conference of the Society for Affective Science, Emotion Regulation Preconference, New Orleans, LA. </w:t>
-      </w:r>
-    </w:p>
-    <w:p>
-      <w:pPr>
-        <w:spacing w:after="31" w:line="259" w:lineRule="auto"/>
-        <w:ind w:left="0" w:firstLine="0"/>
-      </w:pPr>
-      <w:r>
-        <w:t xml:space="preserve"> </w:t>
-      </w:r>
-    </w:p>
-    <w:p>
-      <w:pPr>
-        <w:spacing w:after="1" w:line="240" w:lineRule="auto"/>
-        <w:ind w:left="355" w:right="-1"/>
-        <w:jc w:val="both"/>
-      </w:pPr>
-      <w:r>
+        <w:t xml:space="preserve">Petrova, K.</w:t>
+      </w:r>
+      <w:r>
+        <w:rPr>
+          <w:rFonts w:cs="Aptos"/>
+        </w:rPr>
+        <w:t xml:space="preserve">, &amp; Gross, J. J. (March 2024). Situational Contributors to State Alexithymia: A Mixed-Methods Approach. Annual Conference of the Society for Affective Science, Emotion Regulation Preconference, New Orleans, LA.</w:t>
+      </w:r>
+    </w:p>
+    <w:p>
+      <w:pPr>
+        <w:spacing w:after="120"/>
+        <w:ind w:left="355"/>
+      </w:pPr>
+      <w:r>
+        <w:rPr>
+          <w:rFonts w:cs="Aptos"/>
+          <w:b/>
+        </w:rPr>
+        <w:t xml:space="preserve">Petrova, K.</w:t>
+      </w:r>
+      <w:r>
+        <w:rPr>
+          <w:rFonts w:cs="Aptos"/>
+        </w:rPr>
+        <w:t xml:space="preserve">, &amp; Gross, J. J. (March 2024). Reappraisal as Reasoning: A Computational Affective Science Approach. Annual Conference of the Society for Affective Science, New Orleans, LA.</w:t>
+      </w:r>
+    </w:p>
+    <w:p>
+      <w:pPr>
+        <w:spacing w:after="120"/>
+        <w:ind w:left="355"/>
+      </w:pPr>
+      <w:r>
+        <w:rPr>
+          <w:rFonts w:cs="Aptos"/>
+        </w:rPr>
         <w:t xml:space="preserve">Werner, K. M., </w:t>
       </w:r>
       <w:r>
@@ -2762,217 +2291,175 @@
           <w:rFonts w:cs="Aptos"/>
           <w:b/>
         </w:rPr>
-        <w:t>Petrova, K.</w:t>
-      </w:r>
-      <w:r>
-        <w:t xml:space="preserve">, </w:t>
-      </w:r>
-      <w:proofErr w:type="spellStart"/>
-      <w:r>
-        <w:t>Uusberg</w:t>
-      </w:r>
-      <w:proofErr w:type="spellEnd"/>
-      <w:r>
-        <w:t xml:space="preserve">, A., </w:t>
-      </w:r>
-      <w:proofErr w:type="spellStart"/>
-      <w:r>
-        <w:t>Uusberg</w:t>
-      </w:r>
-      <w:proofErr w:type="spellEnd"/>
-      <w:r>
-        <w:t xml:space="preserve">, H., &amp; Gross, J. J. (March 2024). Unpacking the complexity of emotion </w:t>
-      </w:r>
-      <w:proofErr w:type="spellStart"/>
-      <w:r>
-        <w:t>polyregulation</w:t>
-      </w:r>
-      <w:proofErr w:type="spellEnd"/>
-      <w:r>
-        <w:t xml:space="preserve">. Annual Conference of the Society for Affective Science, Emotion Regulation Preconference, New Orleans, LA. </w:t>
-      </w:r>
-    </w:p>
-    <w:p>
-      <w:pPr>
-        <w:spacing w:after="32" w:line="259" w:lineRule="auto"/>
-        <w:ind w:left="0" w:firstLine="0"/>
-      </w:pPr>
-      <w:r>
-        <w:t xml:space="preserve"> </w:t>
-      </w:r>
-    </w:p>
-    <w:p>
-      <w:pPr>
-        <w:spacing w:after="1" w:line="240" w:lineRule="auto"/>
-        <w:ind w:left="355" w:right="-1"/>
-        <w:jc w:val="both"/>
-      </w:pPr>
-      <w:r>
-        <w:rPr>
-          <w:rFonts w:cs="Aptos"/>
-          <w:b/>
-        </w:rPr>
-        <w:t>Petrova, K.</w:t>
-      </w:r>
-      <w:r>
-        <w:rPr>
-          <w:rFonts w:cs="Aptos"/>
-        </w:rPr>
-        <w:t xml:space="preserve">, †Shaw, J.S., &amp; Gross, J.J. (February 2023). What makes interpersonal emotion regulation work? Examining </w:t>
-      </w:r>
-      <w:r>
-        <w:t xml:space="preserve">the roles of reappraisal and validation. Annual Convention of the Society for Personality and Social Psychology, Atlanta, GA. </w:t>
-      </w:r>
-    </w:p>
-    <w:p>
-      <w:pPr>
-        <w:spacing w:after="26" w:line="259" w:lineRule="auto"/>
-        <w:ind w:left="0" w:firstLine="0"/>
-      </w:pPr>
-      <w:r>
-        <w:t xml:space="preserve"> </w:t>
-      </w:r>
-    </w:p>
-    <w:p>
-      <w:pPr>
-        <w:ind w:left="355" w:right="3"/>
-      </w:pPr>
-      <w:r>
-        <w:rPr>
-          <w:rFonts w:cs="Aptos"/>
-          <w:b/>
-        </w:rPr>
-        <w:t>Petrova, K.</w:t>
-      </w:r>
-      <w:r>
-        <w:t>, Gross, J.J. (March-</w:t>
-      </w:r>
-      <w:r>
-        <w:rPr>
-          <w:rFonts w:cs="Aptos"/>
-        </w:rPr>
-        <w:t>April 2022). Solomon’s paradox in emotion regulation: Exploring the self</w:t>
-      </w:r>
-      <w:r>
-        <w:t xml:space="preserve">-other asymmetry in reappraisal effectiveness. Annual Conference of the Society for Affective Science, Long Beach, CA. </w:t>
-      </w:r>
-    </w:p>
-    <w:p>
-      <w:pPr>
-        <w:spacing w:after="32" w:line="259" w:lineRule="auto"/>
-        <w:ind w:left="0" w:firstLine="0"/>
-      </w:pPr>
-      <w:r>
-        <w:t xml:space="preserve"> </w:t>
-      </w:r>
-    </w:p>
-    <w:p>
-      <w:pPr>
-        <w:ind w:left="355" w:right="3"/>
-      </w:pPr>
-      <w:r>
-        <w:t xml:space="preserve">Preece, D., Mehta, A., </w:t>
-      </w:r>
-      <w:r>
-        <w:rPr>
-          <w:rFonts w:cs="Aptos"/>
-          <w:b/>
-        </w:rPr>
-        <w:t>Petrova, K.</w:t>
-      </w:r>
-      <w:r>
-        <w:t xml:space="preserve">, Sikka, P., Bjureberg, J., Becerra, R., Gross, J.J. (March-April 2022). Alexithymia and Emotion Regulation. Annual Conference of the Society for Affective Science, Long Beach, CA. </w:t>
-      </w:r>
-    </w:p>
-    <w:p>
-      <w:pPr>
-        <w:spacing w:after="26" w:line="259" w:lineRule="auto"/>
-        <w:ind w:left="0" w:firstLine="0"/>
-      </w:pPr>
-      <w:r>
-        <w:t xml:space="preserve"> </w:t>
-      </w:r>
-    </w:p>
-    <w:p>
-      <w:pPr>
-        <w:ind w:left="355" w:right="3"/>
-      </w:pPr>
-      <w:r>
-        <w:rPr>
-          <w:rFonts w:cs="Aptos"/>
-          <w:b/>
-        </w:rPr>
-        <w:t>Petrova, K.</w:t>
-      </w:r>
-      <w:r>
-        <w:t xml:space="preserve">, Nevarez, M.D., Waldinger, R.J., &amp; Schulz, M.S. (February 2021). Variation in the subjective experience of loneliness: Latent profile analysis and links to wellbeing. Annual Convention of the Society for Personality and Social Psychology, virtual. </w:t>
-      </w:r>
-    </w:p>
-    <w:p>
-      <w:pPr>
-        <w:spacing w:after="31" w:line="259" w:lineRule="auto"/>
-        <w:ind w:left="0" w:firstLine="0"/>
-      </w:pPr>
-      <w:r>
-        <w:t xml:space="preserve"> </w:t>
-      </w:r>
-    </w:p>
-    <w:p>
-      <w:pPr>
-        <w:ind w:left="355" w:right="3"/>
-      </w:pPr>
-      <w:r>
-        <w:rPr>
-          <w:rFonts w:cs="Aptos"/>
-          <w:b/>
-        </w:rPr>
-        <w:t>Petrova, K.</w:t>
-      </w:r>
-      <w:r>
-        <w:t xml:space="preserve">, Nevarez, M.D., Rice, J., Waldinger, R.J., Preacher, K.J., &amp; Schulz, M.S. (April 2020). The origins and active ingredients of regulatory flexibility. Annual Conference of the Society for Affective Science, virtual. </w:t>
-      </w:r>
-    </w:p>
-    <w:p>
-      <w:pPr>
-        <w:spacing w:after="0" w:line="259" w:lineRule="auto"/>
-        <w:ind w:left="0" w:firstLine="0"/>
-      </w:pPr>
-      <w:r>
-        <w:t xml:space="preserve"> </w:t>
-      </w:r>
-    </w:p>
-    <w:p>
-      <w:pPr>
-        <w:ind w:left="355" w:right="3"/>
-      </w:pPr>
-      <w:r>
-        <w:t xml:space="preserve">Tharaud, J.B., </w:t>
-      </w:r>
-      <w:r>
-        <w:rPr>
-          <w:rFonts w:cs="Aptos"/>
-          <w:b/>
-        </w:rPr>
-        <w:t>Petrova, K.</w:t>
-      </w:r>
-      <w:r>
-        <w:t xml:space="preserve">, Waldinger, R.J., &amp; Schulz, M.S. (April 2020). In search of memories past: Core relational themes and affective experiences. Annual Conference of the Society for Affective Science, virtual. </w:t>
-      </w:r>
-    </w:p>
-    <w:p>
-      <w:pPr>
-        <w:spacing w:after="26" w:line="259" w:lineRule="auto"/>
-        <w:ind w:left="0" w:firstLine="0"/>
-      </w:pPr>
-      <w:r>
-        <w:t xml:space="preserve"> </w:t>
-      </w:r>
-    </w:p>
-    <w:p>
-      <w:pPr>
-        <w:ind w:left="355" w:right="3"/>
-      </w:pPr>
-      <w:r>
+        <w:t xml:space="preserve">Petrova, K.</w:t>
+      </w:r>
+      <w:r>
+        <w:rPr>
+          <w:rFonts w:cs="Aptos"/>
+        </w:rPr>
+        <w:t xml:space="preserve">, Uusberg, A., Uusberg, H., &amp; Gross, J. J. (March 2024). Unpacking the Complexity of Emotion Polyregulation. Annual Conference of the Society for Affective Science, Emotion Regulation Preconference, New Orleans, LA.</w:t>
+      </w:r>
+    </w:p>
+    <w:p>
+      <w:pPr>
+        <w:spacing w:after="120"/>
+        <w:ind w:left="355"/>
+      </w:pPr>
+      <w:r>
+        <w:rPr>
+          <w:rFonts w:cs="Aptos"/>
+        </w:rPr>
+        <w:t xml:space="preserve">†Zielke, J. N., </w:t>
+      </w:r>
+      <w:r>
+        <w:rPr>
+          <w:rFonts w:cs="Aptos"/>
+          <w:b/>
+        </w:rPr>
+        <w:t xml:space="preserve">Petrova, K.</w:t>
+      </w:r>
+      <w:r>
+        <w:rPr>
+          <w:rFonts w:cs="Aptos"/>
+        </w:rPr>
+        <w:t xml:space="preserve">, Mehta, A., &amp; Gross, J. J. (March 2024). Examining the Causal Role of Reappraisal on Emotion Beliefs and Affective Wellbeing. Annual Conference of the Society for Affective Science, Emotion Regulation Preconference, New Orleans, LA.</w:t>
+      </w:r>
+    </w:p>
+    <w:p>
+      <w:pPr>
+        <w:spacing w:after="120"/>
+        <w:ind w:left="355"/>
+      </w:pPr>
+      <w:r>
+        <w:rPr>
+          <w:rFonts w:cs="Aptos"/>
+          <w:b/>
+        </w:rPr>
+        <w:t xml:space="preserve">Petrova, K.</w:t>
+      </w:r>
+      <w:r>
+        <w:rPr>
+          <w:rFonts w:cs="Aptos"/>
+        </w:rPr>
+        <w:t xml:space="preserve">, †Shaw, J. S., &amp; Gross, J. J. (February 2023). What Makes Interpersonal Emotion Regulation Work? Examining the Roles of Reappraisal and Validation. Annual Convention of the Society for Personality and Social Psychology, Atlanta, GA.</w:t>
+      </w:r>
+    </w:p>
+    <w:p>
+      <w:pPr>
+        <w:spacing w:after="120"/>
+        <w:ind w:left="355"/>
+      </w:pPr>
+      <w:r>
+        <w:rPr>
+          <w:rFonts w:cs="Aptos"/>
+          <w:b/>
+        </w:rPr>
+        <w:t xml:space="preserve">Petrova, K.</w:t>
+      </w:r>
+      <w:r>
+        <w:rPr>
+          <w:rFonts w:cs="Aptos"/>
+        </w:rPr>
+        <w:t xml:space="preserve">, &amp; Gross, J. J. (March–April 2022). Solomon’s Paradox in Emotion Regulation: Exploring the Self-Other Asymmetry in Reappraisal Effectiveness. Annual Conference of the Society for Affective Science, Long Beach, CA.</w:t>
+      </w:r>
+    </w:p>
+    <w:p>
+      <w:pPr>
+        <w:spacing w:after="120"/>
+        <w:ind w:left="355"/>
+      </w:pPr>
+      <w:r>
+        <w:rPr>
+          <w:rFonts w:cs="Aptos"/>
+        </w:rPr>
+        <w:t xml:space="preserve">Preece, D. A., Mehta, A., </w:t>
+      </w:r>
+      <w:r>
+        <w:rPr>
+          <w:rFonts w:cs="Aptos"/>
+          <w:b/>
+        </w:rPr>
+        <w:t xml:space="preserve">Petrova, K.</w:t>
+      </w:r>
+      <w:r>
+        <w:rPr>
+          <w:rFonts w:cs="Aptos"/>
+        </w:rPr>
+        <w:t xml:space="preserve">, Sikka, P., Bjureberg, J., Becerra, R., &amp; Gross, J. J. (March–April 2022). Alexithymia and Emotion Regulation. Annual Conference of the Society for Affective Science, Long Beach, CA.</w:t>
+      </w:r>
+    </w:p>
+    <w:p>
+      <w:pPr>
+        <w:spacing w:after="120"/>
+        <w:ind w:left="355"/>
+      </w:pPr>
+      <w:r>
+        <w:rPr>
+          <w:rFonts w:cs="Aptos"/>
+          <w:b/>
+        </w:rPr>
+        <w:t xml:space="preserve">Petrova, K.</w:t>
+      </w:r>
+      <w:r>
+        <w:rPr>
+          <w:rFonts w:cs="Aptos"/>
+        </w:rPr>
+        <w:t xml:space="preserve">, Nevarez, M. D., Waldinger, R. J., &amp; Schulz, M. S. (February 2021). Variation in the Subjective Experience of Loneliness: Latent Profile Analysis and Links to Wellbeing. Annual Convention of the Society for Personality and Social Psychology, virtual.</w:t>
+      </w:r>
+    </w:p>
+    <w:p>
+      <w:pPr>
+        <w:spacing w:after="120"/>
+        <w:ind w:left="355"/>
+      </w:pPr>
+      <w:r>
+        <w:rPr>
+          <w:rFonts w:cs="Aptos"/>
+          <w:b/>
+        </w:rPr>
+        <w:t xml:space="preserve">Petrova, K.</w:t>
+      </w:r>
+      <w:r>
+        <w:rPr>
+          <w:rFonts w:cs="Aptos"/>
+        </w:rPr>
+        <w:t xml:space="preserve">, Nevarez, M. D., Rice, J., Waldinger, R. J., Preacher, K. J., &amp; Schulz, M. S. (April 2020). The Origins and Active Ingredients of Regulatory Flexibility. Annual Conference of the Society for Affective Science, virtual.</w:t>
+      </w:r>
+    </w:p>
+    <w:p>
+      <w:pPr>
+        <w:spacing w:after="120"/>
+        <w:ind w:left="355"/>
+      </w:pPr>
+      <w:r>
+        <w:rPr>
+          <w:rFonts w:cs="Aptos"/>
+        </w:rPr>
+        <w:t xml:space="preserve">Tharaud, J. B., </w:t>
+      </w:r>
+      <w:r>
+        <w:rPr>
+          <w:rFonts w:cs="Aptos"/>
+          <w:b/>
+        </w:rPr>
+        <w:t xml:space="preserve">Petrova, K.</w:t>
+      </w:r>
+      <w:r>
+        <w:rPr>
+          <w:rFonts w:cs="Aptos"/>
+        </w:rPr>
+        <w:t xml:space="preserve">, Waldinger, R. J., &amp; Schulz, M. S. (April 2020). In Search of Memories Past: Core Relational Themes and Affective Experiences. Annual Conference of the Society for Affective Science, virtual.</w:t>
+      </w:r>
+    </w:p>
+    <w:p>
+      <w:pPr>
+        <w:spacing w:after="120"/>
+        <w:ind w:left="355"/>
+      </w:pPr>
+      <w:r>
+        <w:rPr>
+          <w:rFonts w:cs="Aptos"/>
+        </w:rPr>
         <w:t xml:space="preserve">Rice, J., Anderegg, V., </w:t>
       </w:r>
       <w:r>
@@ -2980,57 +2467,57 @@
           <w:rFonts w:cs="Aptos"/>
           <w:b/>
         </w:rPr>
-        <w:t>Petrova, K.</w:t>
-      </w:r>
-      <w:r>
-        <w:t xml:space="preserve">, Schulz, M., &amp; Waldinger, R. (April 2019). Whose report matters more?: Multiple perspectives on parental relationship satisfaction and their influence on offspring relationship satisfaction later in life. Harvard Psychiatry Day, Boston, MA. </w:t>
-      </w:r>
-    </w:p>
-    <w:p>
-      <w:pPr>
-        <w:spacing w:after="31" w:line="259" w:lineRule="auto"/>
-        <w:ind w:left="0" w:firstLine="0"/>
-      </w:pPr>
-      <w:r>
-        <w:t xml:space="preserve"> </w:t>
-      </w:r>
-    </w:p>
-    <w:p>
-      <w:pPr>
-        <w:ind w:left="355" w:right="3"/>
-      </w:pPr>
-      <w:r>
-        <w:rPr>
-          <w:rFonts w:cs="Aptos"/>
-          <w:b/>
-        </w:rPr>
-        <w:t>Petrova, K.</w:t>
-      </w:r>
-      <w:r>
-        <w:t xml:space="preserve">, Nevarez, M.D., Waldinger, R.J., Preacher, K.J., &amp; Schulz, M.S. (March 2019) Navigating common emotional challenges: The roles of mindfulness and emotional engagement. Annual Conference of the Society for Affective Science, Boston, MA. </w:t>
-      </w:r>
-    </w:p>
-    <w:p>
-      <w:pPr>
-        <w:spacing w:after="32" w:line="259" w:lineRule="auto"/>
-        <w:ind w:left="0" w:firstLine="0"/>
-      </w:pPr>
-      <w:r>
-        <w:t xml:space="preserve"> </w:t>
-      </w:r>
-    </w:p>
-    <w:p>
-      <w:pPr>
-        <w:ind w:left="355" w:right="3"/>
-      </w:pPr>
-      <w:r>
-        <w:rPr>
-          <w:rFonts w:cs="Aptos"/>
-        </w:rPr>
-        <w:t xml:space="preserve">Rice, J., Anderegg, V., Petrova, K, Schulz, M.S., &amp; Waldinger, R.J. (November 2018). Does my parents’ marriage affect </w:t>
-      </w:r>
-      <w:r>
-        <w:t xml:space="preserve">my own?: The impact of parental relationship satisfaction and stability on offspring relationship satisfaction and stability later in life. Annual Meeting of the Association for Behavioral and Cognitive Therapy, Washington, DC. </w:t>
+        <w:t xml:space="preserve">Petrova, K.</w:t>
+      </w:r>
+      <w:r>
+        <w:rPr>
+          <w:rFonts w:cs="Aptos"/>
+        </w:rPr>
+        <w:t xml:space="preserve">, Schulz, M. S., &amp; Waldinger, R. J. (April 2019). Whose Report Matters More? Multiple Perspectives on Parental Relationship Satisfaction and Their Influence on Offspring Relationship Satisfaction Later in Life. Harvard Psychiatry Day, Boston, MA.</w:t>
+      </w:r>
+    </w:p>
+    <w:p>
+      <w:pPr>
+        <w:spacing w:after="120"/>
+        <w:ind w:left="355"/>
+      </w:pPr>
+      <w:r>
+        <w:rPr>
+          <w:rFonts w:cs="Aptos"/>
+          <w:b/>
+        </w:rPr>
+        <w:t xml:space="preserve">Petrova, K.</w:t>
+      </w:r>
+      <w:r>
+        <w:rPr>
+          <w:rFonts w:cs="Aptos"/>
+        </w:rPr>
+        <w:t xml:space="preserve">, Nevarez, M. D., Waldinger, R. J., Preacher, K. J., &amp; Schulz, M. S. (March 2019). Navigating Common Emotional Challenges: The Roles of Mindfulness and Emotional Engagement. Annual Conference of the Society for Affective Science, Boston, MA.</w:t>
+      </w:r>
+    </w:p>
+    <w:p>
+      <w:pPr>
+        <w:spacing w:after="120"/>
+        <w:ind w:left="355"/>
+      </w:pPr>
+      <w:r>
+        <w:rPr>
+          <w:rFonts w:cs="Aptos"/>
+        </w:rPr>
+        <w:t xml:space="preserve">Rice, J., Anderegg, V., </w:t>
+      </w:r>
+      <w:r>
+        <w:rPr>
+          <w:rFonts w:cs="Aptos"/>
+          <w:b/>
+        </w:rPr>
+        <w:t xml:space="preserve">Petrova, K.</w:t>
+      </w:r>
+      <w:r>
+        <w:rPr>
+          <w:rFonts w:cs="Aptos"/>
+        </w:rPr>
+        <w:t xml:space="preserve">, Schulz, M. S., &amp; Waldinger, R. J. (November 2018). Does My Parents’ Marriage Affect My Own? The Impact of Parental Relationship Satisfaction and Stability on Offspring Relationship Satisfaction and Stability Later in Life. Annual Convention of the Association for Behavioral and Cognitive Therapies, Washington, DC.</w:t>
       </w:r>
     </w:p>
     <w:p>
@@ -3201,7 +2688,7 @@
         <w:ind w:left="-5"/>
       </w:pPr>
       <w:r>
-        <w:t>INSTRUCTOR</w:t>
+        <w:t>PRIMARY INSTRUCTOR</w:t>
       </w:r>
       <w:r>
         <w:rPr>
@@ -3213,6 +2700,7 @@
     </w:p>
     <w:p>
       <w:pPr>
+        <w:keepNext/>
         <w:spacing w:after="1" w:line="259" w:lineRule="auto"/>
         <w:ind w:left="-5" w:hanging="10"/>
       </w:pPr>
@@ -3248,6 +2736,7 @@
     </w:p>
     <w:p>
       <w:pPr>
+        <w:keepNext/>
         <w:spacing w:after="1" w:line="259" w:lineRule="auto"/>
         <w:ind w:left="-5" w:hanging="10"/>
       </w:pPr>
@@ -3272,7 +2761,10 @@
         <w:t>Stanford University  •  Summer 2024 (16 enrolled)</w:t>
       </w:r>
       <w:r>
-        <w:t xml:space="preserve"> </w:t>
+        <w:rPr>
+          <w:i/>
+        </w:rPr>
+        <w:t xml:space="preserve">, Summer 2026 (20 enrolled)</w:t>
       </w:r>
     </w:p>
     <w:p>
@@ -3294,6 +2786,335 @@
         <w:pStyle w:val="Heading2"/>
         <w:ind w:left="-5"/>
       </w:pPr>
+      <w:r>
+        <w:t>TEACHING ASSISTANT</w:t>
+      </w:r>
+      <w:r>
+        <w:rPr>
+          <w:color w:val="000000"/>
+        </w:rPr>
+        <w:t xml:space="preserve"> </w:t>
+      </w:r>
+    </w:p>
+    <w:p>
+      <w:pPr>
+        <w:keepNext/>
+        <w:spacing w:after="1" w:line="259" w:lineRule="auto"/>
+        <w:ind w:left="-5" w:hanging="10"/>
+      </w:pPr>
+      <w:r>
+        <w:rPr>
+          <w:rFonts w:cs="Aptos"/>
+          <w:b/>
+        </w:rPr>
+        <w:t xml:space="preserve">PSYCH 205: Foundations of Cognition </w:t>
+      </w:r>
+    </w:p>
+    <w:p>
+      <w:pPr>
+        <w:spacing w:after="4" w:line="250" w:lineRule="auto"/>
+        <w:ind w:left="-5" w:hanging="10"/>
+      </w:pPr>
+      <w:r>
+        <w:rPr>
+          <w:rFonts w:cs="Aptos"/>
+          <w:i/>
+        </w:rPr>
+        <w:t xml:space="preserve">Stanford University  •  Spring 2026 (7 enrolled) </w:t>
+      </w:r>
+    </w:p>
+    <w:p>
+      <w:pPr>
+        <w:spacing w:after="0" w:line="259" w:lineRule="auto"/>
+        <w:ind w:left="0" w:firstLine="0"/>
+      </w:pPr>
+      <w:r>
+        <w:rPr>
+          <w:rFonts w:cs="Aptos"/>
+          <w:b/>
+        </w:rPr>
+        <w:t xml:space="preserve"> </w:t>
+      </w:r>
+    </w:p>
+    <w:p>
+      <w:pPr>
+        <w:keepNext/>
+        <w:spacing w:after="1" w:line="259" w:lineRule="auto"/>
+        <w:ind w:left="-5" w:hanging="10"/>
+      </w:pPr>
+      <w:r>
+        <w:rPr>
+          <w:rFonts w:cs="Aptos"/>
+          <w:b/>
+        </w:rPr>
+        <w:t>PSYCH 198: Honors Seminar in Psychology</w:t>
+      </w:r>
+      <w:r>
+        <w:t xml:space="preserve"> </w:t>
+      </w:r>
+    </w:p>
+    <w:p>
+      <w:pPr>
+        <w:spacing w:after="4" w:line="250" w:lineRule="auto"/>
+        <w:ind w:left="-5" w:hanging="10"/>
+      </w:pPr>
+      <w:r>
+        <w:rPr>
+          <w:rFonts w:cs="Aptos"/>
+          <w:i/>
+        </w:rPr>
+        <w:t xml:space="preserve">Stanford University  •  Fall 2024 (15 enrolled), Spring 2025 (15 enrolled) </w:t>
+      </w:r>
+    </w:p>
+    <w:p>
+      <w:pPr>
+        <w:spacing w:after="0" w:line="259" w:lineRule="auto"/>
+        <w:ind w:left="0" w:firstLine="0"/>
+      </w:pPr>
+      <w:r>
+        <w:t xml:space="preserve"> </w:t>
+      </w:r>
+    </w:p>
+    <w:p>
+      <w:pPr>
+        <w:keepNext/>
+        <w:spacing w:after="1" w:line="259" w:lineRule="auto"/>
+        <w:ind w:left="-5" w:hanging="10"/>
+      </w:pPr>
+      <w:r>
+        <w:rPr>
+          <w:rFonts w:cs="Aptos"/>
+          <w:b/>
+        </w:rPr>
+        <w:t>PSYCH 95: Abnormal Psychology</w:t>
+      </w:r>
+      <w:r>
+        <w:t xml:space="preserve"> </w:t>
+      </w:r>
+    </w:p>
+    <w:p>
+      <w:pPr>
+        <w:spacing w:after="4" w:line="250" w:lineRule="auto"/>
+        <w:ind w:left="-5" w:right="2783" w:hanging="10"/>
+      </w:pPr>
+      <w:r>
+        <w:rPr>
+          <w:rFonts w:cs="Aptos"/>
+          <w:i/>
+        </w:rPr>
+        <w:t xml:space="preserve">Stanford University  •  Spring 2024 (65 enrolled) </w:t>
+      </w:r>
+    </w:p>
+    <w:p>
+      <w:pPr>
+        <w:spacing w:after="0" w:line="259" w:lineRule="auto"/>
+        <w:ind w:left="0" w:firstLine="0"/>
+      </w:pPr>
+      <w:r>
+        <w:t xml:space="preserve"> </w:t>
+      </w:r>
+    </w:p>
+    <w:p>
+      <w:pPr>
+        <w:keepNext/>
+        <w:spacing w:after="1" w:line="259" w:lineRule="auto"/>
+        <w:ind w:left="-5" w:hanging="10"/>
+      </w:pPr>
+      <w:r>
+        <w:rPr>
+          <w:rFonts w:cs="Aptos"/>
+          <w:b/>
+        </w:rPr>
+        <w:t>PSYCH 80: Personality and Affective Science</w:t>
+      </w:r>
+      <w:r>
+        <w:t xml:space="preserve"> </w:t>
+      </w:r>
+    </w:p>
+    <w:p>
+      <w:pPr>
+        <w:spacing w:after="4" w:line="250" w:lineRule="auto"/>
+        <w:ind w:left="-5" w:right="2783" w:hanging="10"/>
+      </w:pPr>
+      <w:r>
+        <w:rPr>
+          <w:rFonts w:cs="Aptos"/>
+          <w:i/>
+        </w:rPr>
+        <w:t xml:space="preserve">Stanford University  •  Winter 2024 (95 enrolled) </w:t>
+      </w:r>
+    </w:p>
+    <w:p>
+      <w:pPr>
+        <w:spacing w:after="0" w:line="259" w:lineRule="auto"/>
+        <w:ind w:left="0" w:firstLine="0"/>
+      </w:pPr>
+      <w:r>
+        <w:t xml:space="preserve"> </w:t>
+      </w:r>
+    </w:p>
+    <w:p>
+      <w:pPr>
+        <w:keepNext/>
+        <w:spacing w:after="1" w:line="259" w:lineRule="auto"/>
+        <w:ind w:left="-5" w:hanging="10"/>
+      </w:pPr>
+      <w:r>
+        <w:rPr>
+          <w:rFonts w:cs="Aptos"/>
+          <w:b/>
+        </w:rPr>
+        <w:t>PSYCH 90: Clinical Psychology</w:t>
+      </w:r>
+      <w:r>
+        <w:t xml:space="preserve"> </w:t>
+      </w:r>
+    </w:p>
+    <w:p>
+      <w:pPr>
+        <w:spacing w:after="4" w:line="250" w:lineRule="auto"/>
+        <w:ind w:left="-5" w:right="2783" w:hanging="10"/>
+      </w:pPr>
+      <w:r>
+        <w:rPr>
+          <w:rFonts w:cs="Aptos"/>
+          <w:i/>
+        </w:rPr>
+        <w:t xml:space="preserve">Stanford University  •  Fall 2023 (121 enrolled) </w:t>
+      </w:r>
+    </w:p>
+    <w:p>
+      <w:pPr>
+        <w:spacing w:after="0" w:line="259" w:lineRule="auto"/>
+        <w:ind w:left="0" w:firstLine="0"/>
+      </w:pPr>
+      <w:r>
+        <w:t xml:space="preserve"> </w:t>
+      </w:r>
+    </w:p>
+    <w:p>
+      <w:pPr>
+        <w:keepNext/>
+        <w:spacing w:after="1" w:line="259" w:lineRule="auto"/>
+        <w:ind w:left="-5" w:hanging="10"/>
+      </w:pPr>
+      <w:r>
+        <w:rPr>
+          <w:rFonts w:cs="Aptos"/>
+          <w:b/>
+        </w:rPr>
+        <w:t>PSYCH 1: Psych One</w:t>
+      </w:r>
+      <w:r>
+        <w:t xml:space="preserve"> </w:t>
+      </w:r>
+    </w:p>
+    <w:p>
+      <w:pPr>
+        <w:spacing w:after="4" w:line="250" w:lineRule="auto"/>
+        <w:ind w:left="-5" w:hanging="10"/>
+      </w:pPr>
+      <w:r>
+        <w:rPr>
+          <w:rFonts w:cs="Aptos"/>
+          <w:i/>
+        </w:rPr>
+        <w:t xml:space="preserve">Stanford University  •  Fall 2022 (354 enrolled), Spring 2023 (283 enrolled) </w:t>
+      </w:r>
+    </w:p>
+    <w:p>
+      <w:pPr>
+        <w:spacing w:after="0" w:line="259" w:lineRule="auto"/>
+        <w:ind w:left="0" w:firstLine="0"/>
+      </w:pPr>
+      <w:r>
+        <w:t xml:space="preserve"> </w:t>
+      </w:r>
+    </w:p>
+    <w:p>
+      <w:pPr>
+        <w:keepNext/>
+        <w:spacing w:after="1" w:line="259" w:lineRule="auto"/>
+        <w:ind w:left="-5" w:hanging="10"/>
+      </w:pPr>
+      <w:r>
+        <w:rPr>
+          <w:rFonts w:cs="Aptos"/>
+          <w:b/>
+        </w:rPr>
+        <w:t>PSYC 314: Multivariate Statistics</w:t>
+      </w:r>
+      <w:r>
+        <w:t xml:space="preserve"> </w:t>
+      </w:r>
+    </w:p>
+    <w:p>
+      <w:pPr>
+        <w:spacing w:after="4" w:line="250" w:lineRule="auto"/>
+        <w:ind w:left="-5" w:hanging="10"/>
+      </w:pPr>
+      <w:r>
+        <w:rPr>
+          <w:rFonts w:cs="Aptos"/>
+          <w:i/>
+        </w:rPr>
+        <w:t xml:space="preserve">Bryn Mawr College  •  Spring 2018 (16 enrolled), Spring 2019 (16 enrolled), Fall 2020 (16 enrolled) </w:t>
+      </w:r>
+    </w:p>
+    <w:p>
+      <w:pPr>
+        <w:spacing w:after="0" w:line="259" w:lineRule="auto"/>
+        <w:ind w:left="0" w:firstLine="0"/>
+      </w:pPr>
+      <w:r>
+        <w:t xml:space="preserve"> </w:t>
+      </w:r>
+    </w:p>
+    <w:p>
+      <w:pPr>
+        <w:keepNext/>
+        <w:spacing w:after="1" w:line="259" w:lineRule="auto"/>
+        <w:ind w:left="-5" w:hanging="10"/>
+      </w:pPr>
+      <w:r>
+        <w:rPr>
+          <w:rFonts w:cs="Aptos"/>
+          <w:b/>
+        </w:rPr>
+        <w:t>PSYC 105: Introductory Psychology</w:t>
+      </w:r>
+      <w:r>
+        <w:t xml:space="preserve"> </w:t>
+      </w:r>
+    </w:p>
+    <w:p>
+      <w:pPr>
+        <w:spacing w:after="89" w:line="250" w:lineRule="auto"/>
+        <w:ind w:left="-5" w:hanging="10"/>
+      </w:pPr>
+      <w:r>
+        <w:rPr>
+          <w:rFonts w:cs="Aptos"/>
+          <w:i/>
+        </w:rPr>
+        <w:t>Bryn Mawr College  •  Fall 2018 (105 enrolled), Fall 2019 (98 enrolled)</w:t>
+      </w:r>
+      <w:r>
+        <w:t xml:space="preserve"> </w:t>
+      </w:r>
+    </w:p>
+    <w:p>
+      <w:pPr>
+        <w:spacing w:after="0" w:line="259" w:lineRule="auto"/>
+        <w:ind w:left="0" w:firstLine="0"/>
+      </w:pPr>
+      <w:r>
+        <w:rPr>
+          <w:rFonts w:cs="Aptos"/>
+          <w:b/>
+        </w:rPr>
+        <w:t xml:space="preserve"> </w:t>
+      </w:r>
     </w:p>
     <w:p>
       <w:pPr>
@@ -3301,7 +3122,7 @@
         <w:ind w:left="-5"/>
       </w:pPr>
       <w:r>
-        <w:t>TEACHING ASSISTANT</w:t>
+        <w:t>GUEST LECTURER</w:t>
       </w:r>
       <w:r>
         <w:rPr>
@@ -3312,6 +3133,7 @@
     </w:p>
     <w:p>
       <w:pPr>
+        <w:keepNext/>
         <w:spacing w:after="1" w:line="259" w:lineRule="auto"/>
         <w:ind w:left="-5" w:hanging="10"/>
       </w:pPr>
@@ -3320,347 +3142,6 @@
           <w:rFonts w:cs="Aptos"/>
           <w:b/>
         </w:rPr>
-        <w:t xml:space="preserve">PSYCH 205: Foundations of Cognition </w:t>
-      </w:r>
-    </w:p>
-    <w:p>
-      <w:pPr>
-        <w:spacing w:after="4" w:line="250" w:lineRule="auto"/>
-        <w:ind w:left="-5" w:hanging="10"/>
-      </w:pPr>
-      <w:r>
-        <w:rPr>
-          <w:rFonts w:cs="Aptos"/>
-          <w:i/>
-        </w:rPr>
-        <w:t>Stanford University  •  Spring 2026 (</w:t>
-      </w:r>
-      <w:r>
-        <w:rPr>
-          <w:rFonts w:cs="Aptos"/>
-          <w:i/>
-        </w:rPr>
-        <w:t xml:space="preserve">7 </w:t>
-      </w:r>
-      <w:r>
-        <w:rPr>
-          <w:rFonts w:cs="Aptos"/>
-          <w:i/>
-        </w:rPr>
-        <w:t xml:space="preserve">enrolled) </w:t>
-      </w:r>
-    </w:p>
-    <w:p>
-      <w:pPr>
-        <w:spacing w:after="0" w:line="259" w:lineRule="auto"/>
-        <w:ind w:left="0" w:firstLine="0"/>
-      </w:pPr>
-      <w:r>
-        <w:rPr>
-          <w:rFonts w:cs="Aptos"/>
-          <w:b/>
-        </w:rPr>
-        <w:t xml:space="preserve"> </w:t>
-      </w:r>
-    </w:p>
-    <w:p>
-      <w:pPr>
-        <w:spacing w:after="1" w:line="259" w:lineRule="auto"/>
-        <w:ind w:left="-5" w:hanging="10"/>
-      </w:pPr>
-      <w:r>
-        <w:rPr>
-          <w:rFonts w:cs="Aptos"/>
-          <w:b/>
-        </w:rPr>
-        <w:t>PSYCH 198: Honors Seminar in Psychology</w:t>
-      </w:r>
-      <w:r>
-        <w:t xml:space="preserve"> </w:t>
-      </w:r>
-    </w:p>
-    <w:p>
-      <w:pPr>
-        <w:spacing w:after="4" w:line="250" w:lineRule="auto"/>
-        <w:ind w:left="-5" w:hanging="10"/>
-      </w:pPr>
-      <w:r>
-        <w:rPr>
-          <w:rFonts w:cs="Aptos"/>
-          <w:i/>
-        </w:rPr>
-        <w:t xml:space="preserve">Stanford University  •  Fall 2024 (15 enrolled), Spring 2025 (15 enrolled) </w:t>
-      </w:r>
-    </w:p>
-    <w:p>
-      <w:pPr>
-        <w:spacing w:after="0" w:line="259" w:lineRule="auto"/>
-        <w:ind w:left="0" w:firstLine="0"/>
-      </w:pPr>
-      <w:r>
-        <w:t xml:space="preserve"> </w:t>
-      </w:r>
-    </w:p>
-    <w:p>
-      <w:pPr>
-        <w:spacing w:after="1" w:line="259" w:lineRule="auto"/>
-        <w:ind w:left="-5" w:hanging="10"/>
-      </w:pPr>
-      <w:r>
-        <w:rPr>
-          <w:rFonts w:cs="Aptos"/>
-          <w:b/>
-        </w:rPr>
-        <w:t>PSYCH 95: Abnormal Psychology</w:t>
-      </w:r>
-      <w:r>
-        <w:t xml:space="preserve"> </w:t>
-      </w:r>
-    </w:p>
-    <w:p>
-      <w:pPr>
-        <w:spacing w:after="4" w:line="250" w:lineRule="auto"/>
-        <w:ind w:left="-5" w:right="2783" w:hanging="10"/>
-      </w:pPr>
-      <w:r>
-        <w:rPr>
-          <w:rFonts w:cs="Aptos"/>
-          <w:i/>
-        </w:rPr>
-        <w:t xml:space="preserve">Stanford University  •  Spring 2024 (65 enrolled) </w:t>
-      </w:r>
-    </w:p>
-    <w:p>
-      <w:pPr>
-        <w:spacing w:after="0" w:line="259" w:lineRule="auto"/>
-        <w:ind w:left="0" w:firstLine="0"/>
-      </w:pPr>
-      <w:r>
-        <w:t xml:space="preserve"> </w:t>
-      </w:r>
-    </w:p>
-    <w:p>
-      <w:pPr>
-        <w:spacing w:after="1" w:line="259" w:lineRule="auto"/>
-        <w:ind w:left="-5" w:hanging="10"/>
-      </w:pPr>
-      <w:r>
-        <w:rPr>
-          <w:rFonts w:cs="Aptos"/>
-          <w:b/>
-        </w:rPr>
-        <w:t>PSYCH 80: Personality and Affective Science</w:t>
-      </w:r>
-      <w:r>
-        <w:t xml:space="preserve"> </w:t>
-      </w:r>
-    </w:p>
-    <w:p>
-      <w:pPr>
-        <w:spacing w:after="4" w:line="250" w:lineRule="auto"/>
-        <w:ind w:left="-5" w:right="2783" w:hanging="10"/>
-      </w:pPr>
-      <w:r>
-        <w:rPr>
-          <w:rFonts w:cs="Aptos"/>
-          <w:i/>
-        </w:rPr>
-        <w:t xml:space="preserve">Stanford University  •  Winter 2024 (95 enrolled) </w:t>
-      </w:r>
-    </w:p>
-    <w:p>
-      <w:pPr>
-        <w:spacing w:after="0" w:line="259" w:lineRule="auto"/>
-        <w:ind w:left="0" w:firstLine="0"/>
-      </w:pPr>
-      <w:r>
-        <w:t xml:space="preserve"> </w:t>
-      </w:r>
-    </w:p>
-    <w:p>
-      <w:pPr>
-        <w:spacing w:after="1" w:line="259" w:lineRule="auto"/>
-        <w:ind w:left="-5" w:hanging="10"/>
-      </w:pPr>
-      <w:r>
-        <w:rPr>
-          <w:rFonts w:cs="Aptos"/>
-          <w:b/>
-        </w:rPr>
-        <w:t>PSYCH 90: Clinical Psychology</w:t>
-      </w:r>
-      <w:r>
-        <w:t xml:space="preserve"> </w:t>
-      </w:r>
-    </w:p>
-    <w:p>
-      <w:pPr>
-        <w:spacing w:after="4" w:line="250" w:lineRule="auto"/>
-        <w:ind w:left="-5" w:right="2783" w:hanging="10"/>
-      </w:pPr>
-      <w:r>
-        <w:rPr>
-          <w:rFonts w:cs="Aptos"/>
-          <w:i/>
-        </w:rPr>
-        <w:t xml:space="preserve">Stanford University  •  Fall 2023 (121 enrolled) </w:t>
-      </w:r>
-    </w:p>
-    <w:p>
-      <w:pPr>
-        <w:spacing w:after="0" w:line="259" w:lineRule="auto"/>
-        <w:ind w:left="0" w:firstLine="0"/>
-      </w:pPr>
-      <w:r>
-        <w:t xml:space="preserve"> </w:t>
-      </w:r>
-    </w:p>
-    <w:p>
-      <w:pPr>
-        <w:spacing w:after="1" w:line="259" w:lineRule="auto"/>
-        <w:ind w:left="-5" w:hanging="10"/>
-      </w:pPr>
-      <w:r>
-        <w:rPr>
-          <w:rFonts w:cs="Aptos"/>
-          <w:b/>
-        </w:rPr>
-        <w:t>PSYCH 1: Psych One</w:t>
-      </w:r>
-      <w:r>
-        <w:t xml:space="preserve"> </w:t>
-      </w:r>
-    </w:p>
-    <w:p>
-      <w:pPr>
-        <w:spacing w:after="4" w:line="250" w:lineRule="auto"/>
-        <w:ind w:left="-5" w:hanging="10"/>
-      </w:pPr>
-      <w:r>
-        <w:rPr>
-          <w:rFonts w:cs="Aptos"/>
-          <w:i/>
-        </w:rPr>
-        <w:t xml:space="preserve">Stanford University  •  Fall 2022 (354 enrolled), Spring 2023 (283 enrolled) </w:t>
-      </w:r>
-    </w:p>
-    <w:p>
-      <w:pPr>
-        <w:spacing w:after="0" w:line="259" w:lineRule="auto"/>
-        <w:ind w:left="0" w:firstLine="0"/>
-      </w:pPr>
-      <w:r>
-        <w:t xml:space="preserve"> </w:t>
-      </w:r>
-    </w:p>
-    <w:p>
-      <w:pPr>
-        <w:spacing w:after="1" w:line="259" w:lineRule="auto"/>
-        <w:ind w:left="-5" w:hanging="10"/>
-      </w:pPr>
-      <w:r>
-        <w:rPr>
-          <w:rFonts w:cs="Aptos"/>
-          <w:b/>
-        </w:rPr>
-        <w:t>PSYC 314: Multivariate Statistics</w:t>
-      </w:r>
-      <w:r>
-        <w:t xml:space="preserve"> </w:t>
-      </w:r>
-    </w:p>
-    <w:p>
-      <w:pPr>
-        <w:spacing w:after="4" w:line="250" w:lineRule="auto"/>
-        <w:ind w:left="-5" w:hanging="10"/>
-      </w:pPr>
-      <w:r>
-        <w:rPr>
-          <w:rFonts w:cs="Aptos"/>
-          <w:i/>
-        </w:rPr>
-        <w:t xml:space="preserve">Bryn Mawr College  •  Spring 2018 (16 enrolled), Spring 2019 (16 enrolled), Fall 2020 (16 enrolled) </w:t>
-      </w:r>
-    </w:p>
-    <w:p>
-      <w:pPr>
-        <w:spacing w:after="0" w:line="259" w:lineRule="auto"/>
-        <w:ind w:left="0" w:firstLine="0"/>
-      </w:pPr>
-      <w:r>
-        <w:t xml:space="preserve"> </w:t>
-      </w:r>
-    </w:p>
-    <w:p>
-      <w:pPr>
-        <w:spacing w:after="1" w:line="259" w:lineRule="auto"/>
-        <w:ind w:left="-5" w:hanging="10"/>
-      </w:pPr>
-      <w:r>
-        <w:rPr>
-          <w:rFonts w:cs="Aptos"/>
-          <w:b/>
-        </w:rPr>
-        <w:t>PSYC 105: Introductory Psychology</w:t>
-      </w:r>
-      <w:r>
-        <w:t xml:space="preserve"> </w:t>
-      </w:r>
-    </w:p>
-    <w:p>
-      <w:pPr>
-        <w:spacing w:after="89" w:line="250" w:lineRule="auto"/>
-        <w:ind w:left="-5" w:hanging="10"/>
-      </w:pPr>
-      <w:r>
-        <w:rPr>
-          <w:rFonts w:cs="Aptos"/>
-          <w:i/>
-        </w:rPr>
-        <w:t>Bryn Mawr College  •  Fall 2018 (105 enrolled), Fall 2019 (98 enrolled)</w:t>
-      </w:r>
-      <w:r>
-        <w:t xml:space="preserve"> </w:t>
-      </w:r>
-    </w:p>
-    <w:p>
-      <w:pPr>
-        <w:spacing w:after="0" w:line="259" w:lineRule="auto"/>
-        <w:ind w:left="0" w:firstLine="0"/>
-      </w:pPr>
-      <w:r>
-        <w:rPr>
-          <w:rFonts w:cs="Aptos"/>
-          <w:b/>
-        </w:rPr>
-        <w:t xml:space="preserve"> </w:t>
-      </w:r>
-    </w:p>
-    <w:p>
-      <w:pPr>
-        <w:pStyle w:val="Heading2"/>
-        <w:ind w:left="-5"/>
-      </w:pPr>
-      <w:r>
-        <w:t>GUEST LECTURER</w:t>
-      </w:r>
-      <w:r>
-        <w:rPr>
-          <w:color w:val="000000"/>
-        </w:rPr>
-        <w:t xml:space="preserve"> </w:t>
-      </w:r>
-    </w:p>
-    <w:p>
-      <w:pPr>
-        <w:spacing w:after="1" w:line="259" w:lineRule="auto"/>
-        <w:ind w:left="-5" w:hanging="10"/>
-      </w:pPr>
-      <w:r>
-        <w:rPr>
-          <w:rFonts w:cs="Aptos"/>
-          <w:b/>
-        </w:rPr>
         <w:t xml:space="preserve">PSYCH 1: </w:t>
       </w:r>
       <w:r>
@@ -3685,7 +3166,7 @@
           <w:rFonts w:cs="Aptos"/>
           <w:i/>
         </w:rPr>
-        <w:t>Stanford University  •  7 quarters (2023-2026)</w:t>
+        <w:t>Stanford University  •  7 quarters (2023–2026)</w:t>
       </w:r>
       <w:r>
         <w:t xml:space="preserve"> </w:t>
@@ -3712,13 +3193,7 @@
         <w:ind w:left="-5"/>
       </w:pPr>
       <w:r>
-        <w:t xml:space="preserve">SUPERVISION OF </w:t>
-      </w:r>
-      <w:r>
-        <w:t xml:space="preserve">UNDERGRADUATE </w:t>
-      </w:r>
-      <w:r>
-        <w:t>HONORS THESES</w:t>
+        <w:t xml:space="preserve">SUPERVISION OF UNDERGRADUATE HONORS THESES</w:t>
       </w:r>
       <w:r>
         <w:rPr>
@@ -3836,6 +3311,7 @@
     </w:p>
     <w:p>
       <w:pPr>
+        <w:spacing w:after="80"/>
         <w:ind w:left="-15" w:right="3" w:firstLine="0"/>
       </w:pPr>
       <w:r>
@@ -3843,38 +3319,18 @@
           <w:rFonts w:cs="Aptos"/>
           <w:b/>
         </w:rPr>
-        <w:t>Ana Costa (2026).</w:t>
-      </w:r>
-      <w:r>
-        <w:t xml:space="preserve"> The Stories We Tell Ourselves: Narrative Closure And The Regulation Of Regret. </w:t>
-      </w:r>
-    </w:p>
-    <w:p>
-      <w:pPr>
-        <w:ind w:left="-15" w:firstLine="0"/>
-      </w:pPr>
-      <w:r>
-        <w:rPr>
-          <w:rFonts w:cs="Aptos"/>
-          <w:b/>
-        </w:rPr>
-        <w:t>Susie Mallen (2026).</w:t>
-      </w:r>
-      <w:r>
-        <w:t xml:space="preserve"> </w:t>
-      </w:r>
-      <w:r>
-        <w:rPr>
-          <w:rFonts w:cs="Aptos"/>
-        </w:rPr>
-        <w:t>What’s done or left undone: the behavioral consequences of counterfactual framing in regret.</w:t>
-      </w:r>
-      <w:r>
-        <w:t xml:space="preserve"> </w:t>
-      </w:r>
-    </w:p>
-    <w:p>
-      <w:pPr>
+        <w:t xml:space="preserve">Ana Costa (2026).</w:t>
+      </w:r>
+      <w:r>
+        <w:rPr>
+          <w:rFonts w:cs="Aptos"/>
+        </w:rPr>
+        <w:t xml:space="preserve"> The Stories We Tell Ourselves: Narrative Closure and the Regulation of Regret.</w:t>
+      </w:r>
+    </w:p>
+    <w:p>
+      <w:pPr>
+        <w:spacing w:after="80"/>
         <w:ind w:left="-15" w:right="3" w:firstLine="0"/>
       </w:pPr>
       <w:r>
@@ -3882,14 +3338,18 @@
           <w:rFonts w:cs="Aptos"/>
           <w:b/>
         </w:rPr>
-        <w:t>Jules Jackson (2026).</w:t>
-      </w:r>
-      <w:r>
-        <w:t xml:space="preserve"> Changes in Primal World Beliefs in Individuals with Major Depressive Disorder During Treatment and Beyond. </w:t>
-      </w:r>
-    </w:p>
-    <w:p>
-      <w:pPr>
+        <w:t xml:space="preserve">Susie Mallen (2026).</w:t>
+      </w:r>
+      <w:r>
+        <w:rPr>
+          <w:rFonts w:cs="Aptos"/>
+        </w:rPr>
+        <w:t xml:space="preserve"> What’s Done or Left Undone: The Behavioral Consequences of Counterfactual Framing in Regret.</w:t>
+      </w:r>
+    </w:p>
+    <w:p>
+      <w:pPr>
+        <w:spacing w:after="80"/>
         <w:ind w:left="-15" w:right="3" w:firstLine="0"/>
       </w:pPr>
       <w:r>
@@ -3897,14 +3357,18 @@
           <w:rFonts w:cs="Aptos"/>
           <w:b/>
         </w:rPr>
-        <w:t>Julia Steinberg Shaw (2025).</w:t>
-      </w:r>
-      <w:r>
-        <w:t xml:space="preserve"> Reappraisal of Daily Experiences of Solitude. </w:t>
-      </w:r>
-    </w:p>
-    <w:p>
-      <w:pPr>
+        <w:t xml:space="preserve">Jules Jackson (2026).</w:t>
+      </w:r>
+      <w:r>
+        <w:rPr>
+          <w:rFonts w:cs="Aptos"/>
+        </w:rPr>
+        <w:t xml:space="preserve"> Changes in Primal World Beliefs in Individuals With Major Depressive Disorder During Treatment and Beyond.</w:t>
+      </w:r>
+    </w:p>
+    <w:p>
+      <w:pPr>
+        <w:spacing w:after="80"/>
         <w:ind w:left="-15" w:right="3" w:firstLine="0"/>
       </w:pPr>
       <w:r>
@@ -3912,14 +3376,18 @@
           <w:rFonts w:cs="Aptos"/>
           <w:b/>
         </w:rPr>
-        <w:t>Lucy Kross Wallace (2024).</w:t>
-      </w:r>
-      <w:r>
-        <w:t xml:space="preserve"> Situational Contributors to State Alexithymia: A Mixed-Methods Approach. </w:t>
-      </w:r>
-    </w:p>
-    <w:p>
-      <w:pPr>
+        <w:t xml:space="preserve">Julia Steinberg Shaw (2025).</w:t>
+      </w:r>
+      <w:r>
+        <w:rPr>
+          <w:rFonts w:cs="Aptos"/>
+        </w:rPr>
+        <w:t xml:space="preserve"> Reappraisal of Daily Experiences of Solitude.</w:t>
+      </w:r>
+    </w:p>
+    <w:p>
+      <w:pPr>
+        <w:spacing w:after="80"/>
         <w:ind w:left="-15" w:right="3" w:firstLine="0"/>
       </w:pPr>
       <w:r>
@@ -3927,49 +3395,51 @@
           <w:rFonts w:cs="Aptos"/>
           <w:b/>
         </w:rPr>
-        <w:t xml:space="preserve">Julia Zielke (2024). </w:t>
-      </w:r>
-      <w:r>
-        <w:t xml:space="preserve">Examining the Causal Role of Reappraisal on Emotion Beliefs and Affective Wellbeing. </w:t>
-      </w:r>
-    </w:p>
-    <w:p>
-      <w:pPr>
-        <w:spacing w:after="135"/>
-        <w:ind w:left="-15" w:firstLine="0"/>
-      </w:pPr>
-      <w:r>
-        <w:rPr>
-          <w:rFonts w:cs="Aptos"/>
-          <w:b/>
-        </w:rPr>
-        <w:t>Sophie Lloyd-Hurwitz (2023).</w:t>
-      </w:r>
-      <w:r>
-        <w:t xml:space="preserve"> </w:t>
-      </w:r>
-      <w:r>
-        <w:rPr>
-          <w:rFonts w:cs="Aptos"/>
-        </w:rPr>
-        <w:t xml:space="preserve">“Emotional </w:t>
-      </w:r>
-      <w:proofErr w:type="spellStart"/>
-      <w:r>
-        <w:rPr>
-          <w:rFonts w:cs="Aptos"/>
-        </w:rPr>
-        <w:t>Stuckness</w:t>
-      </w:r>
-      <w:proofErr w:type="spellEnd"/>
-      <w:r>
-        <w:rPr>
-          <w:rFonts w:cs="Aptos"/>
-        </w:rPr>
-        <w:t xml:space="preserve">”: An Exploratory Study into Failures to Initiate Emotion </w:t>
-      </w:r>
-      <w:r>
-        <w:t xml:space="preserve">Regulation. </w:t>
+        <w:t xml:space="preserve">Lucy Kross Wallace (2024).</w:t>
+      </w:r>
+      <w:r>
+        <w:rPr>
+          <w:rFonts w:cs="Aptos"/>
+        </w:rPr>
+        <w:t xml:space="preserve"> Situational Contributors to State Alexithymia: A Mixed-Methods Approach.</w:t>
+      </w:r>
+    </w:p>
+    <w:p>
+      <w:pPr>
+        <w:spacing w:after="80"/>
+        <w:ind w:left="-15" w:right="3" w:firstLine="0"/>
+      </w:pPr>
+      <w:r>
+        <w:rPr>
+          <w:rFonts w:cs="Aptos"/>
+          <w:b/>
+        </w:rPr>
+        <w:t xml:space="preserve">Julia Zielke (2024).</w:t>
+      </w:r>
+      <w:r>
+        <w:rPr>
+          <w:rFonts w:cs="Aptos"/>
+        </w:rPr>
+        <w:t xml:space="preserve"> Examining the Causal Role of Reappraisal on Emotion Beliefs and Affective Wellbeing.</w:t>
+      </w:r>
+    </w:p>
+    <w:p>
+      <w:pPr>
+        <w:spacing w:after="0"/>
+        <w:ind w:left="-15" w:right="3" w:firstLine="0"/>
+      </w:pPr>
+      <w:r>
+        <w:rPr>
+          <w:rFonts w:cs="Aptos"/>
+          <w:b/>
+        </w:rPr>
+        <w:t xml:space="preserve">Sophie Lloyd-Hurwitz (2023).</w:t>
+      </w:r>
+      <w:r>
+        <w:rPr>
+          <w:rFonts w:cs="Aptos"/>
+        </w:rPr>
+        <w:t xml:space="preserve"> “Emotional Stuckness”: An Exploratory Study Into Failures to Initiate Emotion Regulation.</w:t>
       </w:r>
     </w:p>
     <w:p>
@@ -3985,40 +3455,6 @@
         </w:rPr>
         <w:t xml:space="preserve"> </w:t>
       </w:r>
-    </w:p>
-    <w:p>
-      <w:pPr>
-        <w:pStyle w:val="Heading1"/>
-        <w:ind w:left="-5"/>
-      </w:pPr>
-    </w:p>
-    <w:p>
-      <w:pPr>
-        <w:rPr>
-          <w:lang w:val="en-US" w:eastAsia="en-US"/>
-        </w:rPr>
-      </w:pPr>
-    </w:p>
-    <w:p>
-      <w:pPr>
-        <w:rPr>
-          <w:lang w:val="en-US" w:eastAsia="en-US"/>
-        </w:rPr>
-      </w:pPr>
-    </w:p>
-    <w:p>
-      <w:pPr>
-        <w:rPr>
-          <w:lang w:val="en-US" w:eastAsia="en-US"/>
-        </w:rPr>
-      </w:pPr>
-    </w:p>
-    <w:p>
-      <w:pPr>
-        <w:rPr>
-          <w:lang w:val="en-US" w:eastAsia="en-US"/>
-        </w:rPr>
-      </w:pPr>
     </w:p>
     <w:p>
       <w:pPr>
@@ -4177,7 +3613,7 @@
               <w:rPr>
                 <w:b/>
               </w:rPr>
-              <w:t>Ad-hoc reviewer</w:t>
+              <w:t>Ad Hoc Reviewer</w:t>
             </w:r>
             <w:r>
               <w:t xml:space="preserve">   </w:t>
@@ -4189,24 +3625,7 @@
               <w:ind w:left="0" w:right="1732" w:firstLine="0"/>
             </w:pPr>
             <w:r>
-              <w:t>Affective Science (</w:t>
-            </w:r>
-            <w:r>
-              <w:t>4</w:t>
-            </w:r>
-            <w:r>
-              <w:t xml:space="preserve">), Emotion (4), Cognition and Emotion (1), Emotion Review (2), Computers in Human Behavior (1), JAMA (1), Nature Scientific Reports (2), Journal of Emotion and Psychopathology (2), Cognitive </w:t>
-            </w:r>
-            <w:proofErr w:type="spellStart"/>
-            <w:r>
-              <w:t>Behaviour</w:t>
-            </w:r>
-            <w:proofErr w:type="spellEnd"/>
-            <w:r>
-              <w:t xml:space="preserve"> Therapy (1), Psychiatry Psychology and Law (1)</w:t>
-            </w:r>
-            <w:r>
-              <w:t>, Personality and Social Psychology Bulletin (1)</w:t>
+              <w:t xml:space="preserve">Affective Science (4), Emotion (4), Cognition and Emotion (1), Emotion Review (2), Computers in Human Behavior (1), JAMA (1), Nature Scientific Reports (2), Journal of Emotion and Psychopathology (2), Cognitive Behaviour Therapy (1), Psychiatry Psychology and Law (1), Personality and Social Psychology Bulletin (1)</w:t>
             </w:r>
           </w:p>
         </w:tc>
@@ -4258,16 +3677,17 @@
           <w:p>
             <w:pPr>
               <w:spacing w:after="0" w:line="259" w:lineRule="auto"/>
-              <w:ind w:left="0" w:right="1400" w:firstLine="0"/>
+              <w:ind w:left="0" w:firstLine="0"/>
             </w:pPr>
             <w:r>
               <w:rPr>
                 <w:b/>
               </w:rPr>
-              <w:t>Society for Affective Science Student Committee (SASSC) member-at-large</w:t>
+              <w:t>Society for Affective Science Student Committee (SASSC) Member-at-Large</w:t>
             </w:r>
             <w:r>
-              <w:t xml:space="preserve">  Society for Affective Science </w:t>
+              <w:br/>
+              <w:t xml:space="preserve">Society for Affective Science</w:t>
             </w:r>
           </w:p>
         </w:tc>
@@ -4319,7 +3739,7 @@
           <w:p>
             <w:pPr>
               <w:spacing w:after="0" w:line="259" w:lineRule="auto"/>
-              <w:ind w:left="0" w:right="4195" w:firstLine="0"/>
+              <w:ind w:left="0" w:firstLine="0"/>
             </w:pPr>
             <w:r>
               <w:rPr>
@@ -4328,7 +3748,8 @@
               <w:t>Annual Meeting Organizing Committee Member</w:t>
             </w:r>
             <w:r>
-              <w:t xml:space="preserve">   Bay Area Affective Science Society </w:t>
+              <w:br/>
+              <w:t xml:space="preserve">Bay Area Affective Science Society</w:t>
             </w:r>
           </w:p>
         </w:tc>
@@ -4379,6 +3800,7 @@
           </w:tcPr>
           <w:p>
             <w:pPr>
+              <w:keepNext/>
               <w:spacing w:after="0" w:line="259" w:lineRule="auto"/>
               <w:ind w:left="0" w:firstLine="0"/>
             </w:pPr>
@@ -4450,7 +3872,7 @@
           <w:p>
             <w:pPr>
               <w:spacing w:after="0" w:line="259" w:lineRule="auto"/>
-              <w:ind w:left="0" w:right="3461" w:firstLine="0"/>
+              <w:ind w:left="0" w:firstLine="0"/>
             </w:pPr>
             <w:r>
               <w:rPr>
@@ -4459,7 +3881,8 @@
               <w:t>Graduate Program Committee Student Member</w:t>
             </w:r>
             <w:r>
-              <w:t xml:space="preserve">   Department of Psychology, Stanford University </w:t>
+              <w:br/>
+              <w:t xml:space="preserve">Department of Psychology, Stanford University</w:t>
             </w:r>
           </w:p>
         </w:tc>
@@ -4511,7 +3934,7 @@
           <w:p>
             <w:pPr>
               <w:spacing w:after="0" w:line="259" w:lineRule="auto"/>
-              <w:ind w:left="0" w:right="3511" w:firstLine="0"/>
+              <w:ind w:left="0" w:firstLine="0"/>
             </w:pPr>
             <w:r>
               <w:rPr>
@@ -4520,7 +3943,8 @@
               <w:t>Affective Science Seminar Series Co-Organizer</w:t>
             </w:r>
             <w:r>
-              <w:t xml:space="preserve">   Department of Psychology, Stanford University </w:t>
+              <w:br/>
+              <w:t xml:space="preserve">Department of Psychology, Stanford University</w:t>
             </w:r>
           </w:p>
         </w:tc>
@@ -4648,7 +4072,7 @@
               <w:rPr>
                 <w:b/>
               </w:rPr>
-              <w:t>Psychology major representative</w:t>
+              <w:t>Psychology Major Representative</w:t>
             </w:r>
             <w:r>
               <w:t xml:space="preserve">   </w:t>
@@ -4699,6 +4123,7 @@
     </w:p>
     <w:p>
       <w:pPr>
+        <w:keepNext/>
         <w:tabs>
           <w:tab w:val="right" w:pos="10101"/>
         </w:tabs>
@@ -4710,12 +4135,10 @@
           <w:rFonts w:cs="Aptos"/>
           <w:b/>
         </w:rPr>
-        <w:t>Faculty search committee member</w:t>
+        <w:t>Faculty Search Committee Member</w:t>
       </w:r>
       <w:r>
         <w:t xml:space="preserve">  </w:t>
-      </w:r>
-      <w:r>
         <w:tab/>
         <w:t>2019</w:t>
       </w:r>
@@ -4863,7 +4286,7 @@
           <w:rFonts w:cs="Aptos"/>
           <w:b/>
         </w:rPr>
-        <w:t>Paths to PhD speaker</w:t>
+        <w:t>Paths to PhD Speaker</w:t>
       </w:r>
       <w:r>
         <w:t xml:space="preserve">  </w:t>
@@ -4876,8 +4299,6 @@
       </w:r>
       <w:r>
         <w:t xml:space="preserve"> </w:t>
-      </w:r>
-      <w:r>
         <w:tab/>
         <w:t>2021</w:t>
       </w:r>
@@ -4912,7 +4333,7 @@
           <w:rFonts w:cs="Aptos"/>
           <w:b/>
         </w:rPr>
-        <w:t>Committee member</w:t>
+        <w:t>Committee Member</w:t>
       </w:r>
       <w:r>
         <w:t xml:space="preserve">  </w:t>
@@ -4925,8 +4346,6 @@
       </w:r>
       <w:r>
         <w:t xml:space="preserve"> </w:t>
-      </w:r>
-      <w:r>
         <w:tab/>
         <w:t>2020</w:t>
       </w:r>
@@ -4946,10 +4365,7 @@
         <w:ind w:left="-15" w:right="3" w:firstLine="0"/>
       </w:pPr>
       <w:r>
-        <w:t>International Students Planning and Programming Committee</w:t>
-      </w:r>
-      <w:r>
-        <w:t>.</w:t>
+        <w:t>International Students Planning and Programming Committee.</w:t>
       </w:r>
     </w:p>
     <w:p>
@@ -5082,66 +4498,43 @@
     </w:p>
     <w:p>
       <w:pPr>
-        <w:ind w:left="355" w:right="3"/>
-      </w:pPr>
-      <w:r>
-        <w:t>Scientific Auditor and Co-</w:t>
-      </w:r>
-      <w:r>
-        <w:rPr>
-          <w:rFonts w:cs="Aptos"/>
-        </w:rPr>
-        <w:t xml:space="preserve">Author (Appendix: “Evaluating the Evidence”)  •  Zaki, J. (2024). Hope for Cynics: The </w:t>
-      </w:r>
-      <w:r>
-        <w:t xml:space="preserve">Surprising Science of Human Goodness. (pp. 213-224, Appendix B). Grand Central Publishing. </w:t>
-      </w:r>
-    </w:p>
-    <w:p>
-      <w:pPr>
-        <w:spacing w:after="26" w:line="259" w:lineRule="auto"/>
-        <w:ind w:left="0" w:firstLine="0"/>
-      </w:pPr>
-      <w:r>
-        <w:t xml:space="preserve"> </w:t>
-      </w:r>
-    </w:p>
-    <w:p>
-      <w:pPr>
-        <w:ind w:left="-15" w:right="3" w:firstLine="0"/>
-      </w:pPr>
-      <w:r>
-        <w:rPr>
-          <w:rFonts w:cs="Aptos"/>
-          <w:b/>
-        </w:rPr>
-        <w:t>Petrova, K.</w:t>
-      </w:r>
-      <w:r>
-        <w:t xml:space="preserve"> (October 2023). Mastering the art of emotion regulation: Three steps to make you feel better. Psychology </w:t>
-      </w:r>
-    </w:p>
-    <w:p>
-      <w:pPr>
-        <w:ind w:left="360" w:right="3" w:firstLine="0"/>
-      </w:pPr>
-      <w:r>
-        <w:t xml:space="preserve">Today. </w:t>
+        <w:spacing w:after="120"/>
+        <w:ind w:left="355"/>
+      </w:pPr>
+      <w:r>
+        <w:rPr>
+          <w:rFonts w:cs="Aptos"/>
+        </w:rPr>
+        <w:t xml:space="preserve">Scientific Auditor and Co-Author (Appendix B: “Evaluating the Evidence”)  •  Zaki, J. (2024). Hope for Cynics: The Surprising Science of Human Goodness (pp. 213–224). Grand Central Publishing.</w:t>
+      </w:r>
+    </w:p>
+    <w:p>
+      <w:pPr>
+        <w:spacing w:after="120"/>
+        <w:ind w:left="355"/>
+      </w:pPr>
+      <w:r>
+        <w:rPr>
+          <w:rFonts w:cs="Aptos"/>
+          <w:b/>
+        </w:rPr>
+        <w:t xml:space="preserve">Petrova, K.</w:t>
+      </w:r>
+      <w:r>
+        <w:rPr>
+          <w:rFonts w:cs="Aptos"/>
+        </w:rPr>
+        <w:t xml:space="preserve"> (October 2023). Mastering the Art of Emotion Regulation: Three Steps to Make You Feel Better. Psychology Today. </w:t>
       </w:r>
       <w:hyperlink r:id="rId23" w:history="1">
         <w:r>
           <w:rPr>
             <w:rStyle w:val="Hyperlink"/>
+            <w:rFonts w:cs="Aptos"/>
           </w:rPr>
           <w:t>https://www.psychologytoday.com/us/blog/feel-better/202310/mastering-the-art-of-rethinking</w:t>
         </w:r>
       </w:hyperlink>
-      <w:r>
-        <w:t xml:space="preserve"> </w:t>
-      </w:r>
-      <w:r>
-        <w:t xml:space="preserve"> </w:t>
-      </w:r>
     </w:p>
     <w:p>
       <w:pPr>
@@ -5165,7 +4558,7 @@
         <w:rPr>
           <w:rFonts w:cs="Aptos"/>
         </w:rPr>
-        <w:t xml:space="preserve">host  •  Stanford Psychology Podcast (5 episodes) 2021. </w:t>
+        <w:t xml:space="preserve">Host  •  Stanford Psychology Podcast (5 episodes), 2021. </w:t>
       </w:r>
       <w:hyperlink r:id="rId24" w:history="1">
         <w:r>
@@ -5640,7 +5033,7 @@
     </w:p>
     <w:p>
       <w:pPr>
-        <w:spacing w:after="1" w:line="259" w:lineRule="auto"/>
+        <w:spacing w:before="80" w:after="1" w:line="259" w:lineRule="auto"/>
         <w:ind w:left="-5" w:hanging="10"/>
       </w:pPr>
       <w:r>
@@ -5666,39 +5059,7 @@
         <w:t xml:space="preserve">Proficient: </w:t>
       </w:r>
       <w:r>
-        <w:t>R (</w:t>
-      </w:r>
-      <w:proofErr w:type="spellStart"/>
-      <w:r>
-        <w:t>tidyverse</w:t>
-      </w:r>
-      <w:proofErr w:type="spellEnd"/>
-      <w:r>
-        <w:t xml:space="preserve">, lme4, brms, </w:t>
-      </w:r>
-      <w:proofErr w:type="spellStart"/>
-      <w:r>
-        <w:t>lavaan</w:t>
-      </w:r>
-      <w:proofErr w:type="spellEnd"/>
-      <w:r>
-        <w:t xml:space="preserve">), Python (NumPy, Pandas, </w:t>
-      </w:r>
-      <w:proofErr w:type="spellStart"/>
-      <w:r>
-        <w:t>PyTorch</w:t>
-      </w:r>
-      <w:proofErr w:type="spellEnd"/>
-      <w:r>
-        <w:t xml:space="preserve">, scikit-learn, Matplotlib), </w:t>
-      </w:r>
-      <w:proofErr w:type="spellStart"/>
-      <w:r>
-        <w:t>Mplus</w:t>
-      </w:r>
-      <w:proofErr w:type="spellEnd"/>
-      <w:r>
-        <w:t xml:space="preserve">, SPSS, Amos, HLM, Git/GitHub </w:t>
+        <w:t xml:space="preserve">R (tidyverse, lme4, brms, lavaan), Python (NumPy, Pandas, PyTorch, scikit-learn, Matplotlib), Mplus, SPSS, Amos, HLM, Git/GitHub </w:t>
       </w:r>
     </w:p>
     <w:p>
@@ -5713,32 +5074,7 @@
         <w:t xml:space="preserve">Intermediate: </w:t>
       </w:r>
       <w:r>
-        <w:t>JavaScript (</w:t>
-      </w:r>
-      <w:proofErr w:type="spellStart"/>
-      <w:r>
-        <w:t>jsPsych</w:t>
-      </w:r>
-      <w:proofErr w:type="spellEnd"/>
-      <w:r>
-        <w:t xml:space="preserve">), </w:t>
-      </w:r>
-      <w:proofErr w:type="spellStart"/>
-      <w:r>
-        <w:t>webppl</w:t>
-      </w:r>
-      <w:proofErr w:type="spellEnd"/>
-      <w:r>
-        <w:t xml:space="preserve">, MATLAB, FSL </w:t>
-      </w:r>
-    </w:p>
-    <w:p>
-      <w:pPr>
-        <w:spacing w:after="0" w:line="259" w:lineRule="auto"/>
-        <w:ind w:left="0" w:firstLine="0"/>
-      </w:pPr>
-      <w:r>
-        <w:t xml:space="preserve"> </w:t>
+        <w:t xml:space="preserve">JavaScript (jsPsych), webppl, MATLAB, FSL </w:t>
       </w:r>
     </w:p>
     <w:sectPr>
@@ -5874,7 +5210,14 @@
         <w:rFonts w:ascii="Calibri" w:eastAsia="Calibri" w:hAnsi="Calibri" w:cs="Calibri"/>
         <w:lang w:val="en-US"/>
       </w:rPr>
-      <w:t>May 2026</w:t>
+      <w:t>October</w:t>
+    </w:r>
+    <w:r>
+      <w:rPr>
+        <w:rFonts w:ascii="Calibri" w:eastAsia="Calibri" w:hAnsi="Calibri" w:cs="Calibri"/>
+        <w:lang w:val="en-US"/>
+      </w:rPr>
+      <w:t xml:space="preserve"> 2026</w:t>
     </w:r>
   </w:p>
 </w:hdr>

</xml_diff>